<commit_message>
finished week 4 homework
</commit_message>
<xml_diff>
--- a/capstone/Required_Capstone_Checkpoint_4_1_Worksheet.docx
+++ b/capstone/Required_Capstone_Checkpoint_4_1_Worksheet.docx
@@ -532,35 +532,24 @@
           </w:tcPr>
           <w:p>
             <w:pPr>
-              <w:spacing w:after="120"/>
+              <w:rPr>
+                <w:lang w:eastAsia="en-US"/>
+              </w:rPr>
+            </w:pPr>
+            <w:r>
+              <w:t>My system usually finds the article needed to answer a question, but it also retrieves articles that add little useful information. Since I only pass three articles to the model, those weaker matches take up space that could be used for better supporting evidence.</w:t>
+            </w:r>
+          </w:p>
+          <w:p>
+            <w:pPr>
               <w:rPr>
                 <w:sz w:val="24"/>
                 <w:szCs w:val="24"/>
               </w:rPr>
             </w:pPr>
             <w:r>
-              <w:rPr>
-                <w:sz w:val="24"/>
-                <w:szCs w:val="24"/>
-              </w:rPr>
-              <w:t>Response</w:t>
-            </w:r>
-            <w:r>
-              <w:rPr>
-                <w:sz w:val="24"/>
-                <w:szCs w:val="24"/>
-              </w:rPr>
-              <w:t>:</w:t>
-            </w:r>
-          </w:p>
-          <w:p>
-            <w:pPr>
-              <w:spacing w:after="120"/>
-              <w:rPr>
-                <w:sz w:val="24"/>
-                <w:szCs w:val="24"/>
-              </w:rPr>
-            </w:pPr>
+              <w:t>This has not consistently caused wrong answers in my tests, but it gives the model unnecessary text to process and creates more opportunities for distraction.</w:t>
+            </w:r>
           </w:p>
         </w:tc>
       </w:tr>
@@ -616,6 +605,7 @@
                 <w:sz w:val="24"/>
                 <w:szCs w:val="24"/>
               </w:rPr>
+              <w:lastRenderedPageBreak/>
               <w:t>Evidence supporting the identified limitation</w:t>
             </w:r>
           </w:p>
@@ -638,35 +628,70 @@
           </w:tcPr>
           <w:p>
             <w:pPr>
-              <w:spacing w:after="120"/>
-              <w:rPr>
-                <w:sz w:val="24"/>
-                <w:szCs w:val="24"/>
+              <w:rPr>
+                <w:lang w:eastAsia="en-US"/>
               </w:rPr>
             </w:pPr>
             <w:r>
-              <w:rPr>
-                <w:sz w:val="24"/>
-                <w:szCs w:val="24"/>
-              </w:rPr>
-              <w:t>Response</w:t>
-            </w:r>
-            <w:r>
-              <w:rPr>
-                <w:sz w:val="24"/>
-                <w:szCs w:val="24"/>
-              </w:rPr>
-              <w:t>:</w:t>
-            </w:r>
-          </w:p>
-          <w:p>
-            <w:pPr>
-              <w:spacing w:after="120"/>
-              <w:rPr>
-                <w:sz w:val="24"/>
-                <w:szCs w:val="24"/>
-              </w:rPr>
-            </w:pPr>
+              <w:t xml:space="preserve">For the question about the first three picks in the 2026 NFL draft, the baseline retrieved </w:t>
+            </w:r>
+            <w:proofErr w:type="spellStart"/>
+            <w:r>
+              <w:t>Baltimore_Ravens</w:t>
+            </w:r>
+            <w:proofErr w:type="spellEnd"/>
+            <w:r>
+              <w:t>, 2026_NFL_draft, and 2021_NBA_draft. It found the correct article, but it also included a draft from the wrong sport and year.</w:t>
+            </w:r>
+          </w:p>
+          <w:p>
+            <w:r>
+              <w:t xml:space="preserve">For the Brady Bunch house question, it retrieved </w:t>
+            </w:r>
+            <w:proofErr w:type="spellStart"/>
+            <w:proofErr w:type="gramStart"/>
+            <w:r>
+              <w:t>The</w:t>
+            </w:r>
+            <w:proofErr w:type="gramEnd"/>
+            <w:r>
+              <w:t>_Brady_Bunch</w:t>
+            </w:r>
+            <w:proofErr w:type="spellEnd"/>
+            <w:r>
+              <w:t xml:space="preserve">, </w:t>
+            </w:r>
+            <w:proofErr w:type="spellStart"/>
+            <w:proofErr w:type="gramStart"/>
+            <w:r>
+              <w:t>Once</w:t>
+            </w:r>
+            <w:proofErr w:type="gramEnd"/>
+            <w:r>
+              <w:t>_Upon_a_Time_in_Hollywood</w:t>
+            </w:r>
+            <w:proofErr w:type="spellEnd"/>
+            <w:r>
+              <w:t xml:space="preserve">, and </w:t>
+            </w:r>
+            <w:proofErr w:type="spellStart"/>
+            <w:proofErr w:type="gramStart"/>
+            <w:r>
+              <w:t>The</w:t>
+            </w:r>
+            <w:proofErr w:type="gramEnd"/>
+            <w:r>
+              <w:t>_Washington_Post</w:t>
+            </w:r>
+            <w:proofErr w:type="spellEnd"/>
+            <w:r>
+              <w:t>. The Brady Bunch article contained both the date and price, and the other two articles were not needed for the answer.</w:t>
+            </w:r>
+          </w:p>
+          <w:p>
+            <w:r>
+              <w:t>The latest baseline evaluation passed all three questions. That shows the problem is mainly the quality of the extra context, rather than a failure to find the answer.</w:t>
+            </w:r>
           </w:p>
         </w:tc>
       </w:tr>
@@ -988,44 +1013,25 @@
           <w:p>
             <w:pPr>
               <w:rPr>
-                <w:sz w:val="24"/>
-                <w:szCs w:val="24"/>
+                <w:lang w:eastAsia="en-US"/>
               </w:rPr>
             </w:pPr>
             <w:r>
-              <w:rPr>
-                <w:sz w:val="24"/>
-                <w:szCs w:val="24"/>
-              </w:rPr>
-              <w:t>Response:</w:t>
-            </w:r>
-          </w:p>
-          <w:p>
-            <w:pPr>
-              <w:spacing w:after="120"/>
-              <w:rPr>
-                <w:sz w:val="24"/>
-                <w:szCs w:val="24"/>
-              </w:rPr>
-            </w:pPr>
-          </w:p>
-          <w:p>
-            <w:pPr>
-              <w:spacing w:after="120"/>
-              <w:rPr>
-                <w:sz w:val="24"/>
-                <w:szCs w:val="24"/>
-              </w:rPr>
-            </w:pPr>
-          </w:p>
-          <w:p>
-            <w:pPr>
-              <w:spacing w:after="120"/>
-              <w:rPr>
-                <w:sz w:val="24"/>
-                <w:szCs w:val="24"/>
-              </w:rPr>
-            </w:pPr>
+              <w:t xml:space="preserve">The retriever looks for matching words and similar meaning, but it does not check whether each article </w:t>
+            </w:r>
+            <w:proofErr w:type="gramStart"/>
+            <w:r>
+              <w:t>actually helps</w:t>
+            </w:r>
+            <w:proofErr w:type="gramEnd"/>
+            <w:r>
+              <w:t xml:space="preserve"> answer the question. An NBA draft article can match an NFL draft question because both discuss players, picks, and drafts.</w:t>
+            </w:r>
+          </w:p>
+          <w:p>
+            <w:r>
+              <w:t>The system also returns three results even when only one is strongly relevant. Without a relevance cutoff, weaker matches still make it into the answer context. In these examples, the needed information was already in one article, so the main issue was unnecessary context rather than missing a second retrieval step.</w:t>
+            </w:r>
           </w:p>
         </w:tc>
       </w:tr>
@@ -1099,35 +1105,30 @@
           <w:p>
             <w:pPr>
               <w:rPr>
-                <w:sz w:val="24"/>
-                <w:szCs w:val="24"/>
+                <w:lang w:eastAsia="en-US"/>
               </w:rPr>
             </w:pPr>
             <w:r>
-              <w:rPr>
-                <w:sz w:val="24"/>
-                <w:szCs w:val="24"/>
-              </w:rPr>
-              <w:t>Response:</w:t>
-            </w:r>
-          </w:p>
-          <w:p>
-            <w:pPr>
-              <w:spacing w:after="120"/>
-              <w:rPr>
-                <w:sz w:val="24"/>
-                <w:szCs w:val="24"/>
-              </w:rPr>
-            </w:pPr>
-          </w:p>
-          <w:p>
-            <w:pPr>
-              <w:spacing w:after="120"/>
-              <w:rPr>
-                <w:sz w:val="24"/>
-                <w:szCs w:val="24"/>
-              </w:rPr>
-            </w:pPr>
+              <w:t>The baseline searches once using the whole question and ranks each article separately. It does not ask whether the selected articles work well together or whether each one adds useful evidence.</w:t>
+            </w:r>
+          </w:p>
+          <w:p>
+            <w:r>
+              <w:t xml:space="preserve">It also does not follow hyperlinks between articles. Those connections could help with questions that span related subjects, but they are not automatically useful. In my graph test, the system added </w:t>
+            </w:r>
+            <w:proofErr w:type="spellStart"/>
+            <w:proofErr w:type="gramStart"/>
+            <w:r>
+              <w:t>Nashville,_</w:t>
+            </w:r>
+            <w:proofErr w:type="gramEnd"/>
+            <w:r>
+              <w:t>Tennessee</w:t>
+            </w:r>
+            <w:proofErr w:type="spellEnd"/>
+            <w:r>
+              <w:t xml:space="preserve"> to the Cooter Davenport results. That showed me that following relationships still needs careful filtering.</w:t>
+            </w:r>
           </w:p>
           <w:p>
             <w:pPr>
@@ -1323,7 +1324,6 @@
           <w:sz w:val="24"/>
           <w:szCs w:val="24"/>
         </w:rPr>
-        <w:lastRenderedPageBreak/>
         <w:t>Graph-based retrieval</w:t>
       </w:r>
     </w:p>
@@ -1412,44 +1412,17 @@
           <w:p>
             <w:pPr>
               <w:rPr>
-                <w:sz w:val="24"/>
-                <w:szCs w:val="24"/>
+                <w:lang w:eastAsia="en-US"/>
               </w:rPr>
             </w:pPr>
             <w:r>
-              <w:rPr>
-                <w:sz w:val="24"/>
-                <w:szCs w:val="24"/>
-              </w:rPr>
-              <w:t>Response:</w:t>
-            </w:r>
-          </w:p>
-          <w:p>
-            <w:pPr>
-              <w:spacing w:after="120"/>
-              <w:rPr>
-                <w:sz w:val="24"/>
-                <w:szCs w:val="24"/>
-              </w:rPr>
-            </w:pPr>
-          </w:p>
-          <w:p>
-            <w:pPr>
-              <w:spacing w:after="120"/>
-              <w:rPr>
-                <w:sz w:val="24"/>
-                <w:szCs w:val="24"/>
-              </w:rPr>
-            </w:pPr>
-          </w:p>
-          <w:p>
-            <w:pPr>
-              <w:spacing w:after="120"/>
-              <w:rPr>
-                <w:sz w:val="24"/>
-                <w:szCs w:val="24"/>
-              </w:rPr>
-            </w:pPr>
+              <w:t>I chose query decomposition and graph-based retrieval. Decomposition breaks a question into smaller, focused searches, then combines the results and removes duplicate articles.</w:t>
+            </w:r>
+          </w:p>
+          <w:p>
+            <w:r>
+              <w:t>Graph retrieval follows hyperlinks between my saved Wikipedia articles. It starts with two search results and selects one linked article as additional context. I keep the total at three documents and compare four approaches: baseline, decomposition, graph retrieval, and both techniques together.</w:t>
+            </w:r>
           </w:p>
         </w:tc>
       </w:tr>
@@ -1516,44 +1489,22 @@
           <w:p>
             <w:pPr>
               <w:rPr>
-                <w:sz w:val="24"/>
-                <w:szCs w:val="24"/>
+                <w:lang w:eastAsia="en-US"/>
               </w:rPr>
             </w:pPr>
             <w:r>
-              <w:rPr>
-                <w:sz w:val="24"/>
-                <w:szCs w:val="24"/>
-              </w:rPr>
-              <w:t>Response:</w:t>
-            </w:r>
-          </w:p>
-          <w:p>
-            <w:pPr>
-              <w:spacing w:after="120"/>
-              <w:rPr>
-                <w:sz w:val="24"/>
-                <w:szCs w:val="24"/>
-              </w:rPr>
-            </w:pPr>
-          </w:p>
-          <w:p>
-            <w:pPr>
-              <w:spacing w:after="120"/>
-              <w:rPr>
-                <w:sz w:val="24"/>
-                <w:szCs w:val="24"/>
-              </w:rPr>
-            </w:pPr>
-          </w:p>
-          <w:p>
-            <w:pPr>
-              <w:spacing w:after="120"/>
-              <w:rPr>
-                <w:sz w:val="24"/>
-                <w:szCs w:val="24"/>
-              </w:rPr>
-            </w:pPr>
+              <w:t>I chose these approaches because my baseline often finds the right article but includes extra articles that do not help answer the question. Decomposition gives each part of a question its own search. For example, the Brady Bunch house question asks for both a sale date and a price, so searching for those separately might find better supporting information.</w:t>
+            </w:r>
+          </w:p>
+          <w:p>
+            <w:r>
+              <w:t>Wikipedia hyperlinks also give me relationships that the baseline search does not explicitly use. Following those links could help find useful supporting articles. Limiting the search to one hop and three documents prevents the graph from adding an unlimited amount of context.</w:t>
+            </w:r>
+          </w:p>
+          <w:p>
+            <w:r>
+              <w:t>So far, the results have not shown a clear improvement in answer accuracy. Some linked articles were still unnecessary, and some evaluation grades need review. The approach gives me a way to explore related information, but I still need to improve how the system decides which extra context is useful.</w:t>
+            </w:r>
           </w:p>
         </w:tc>
       </w:tr>
@@ -1757,586 +1708,28 @@
           <w:p>
             <w:pPr>
               <w:rPr>
-                <w:sz w:val="24"/>
-                <w:szCs w:val="24"/>
+                <w:lang w:eastAsia="en-US"/>
               </w:rPr>
             </w:pPr>
             <w:r>
-              <w:rPr>
-                <w:sz w:val="24"/>
-                <w:szCs w:val="24"/>
-              </w:rPr>
-              <w:t>Response:</w:t>
-            </w:r>
-          </w:p>
-          <w:p>
-            <w:pPr>
-              <w:spacing w:after="120"/>
-              <w:rPr>
-                <w:sz w:val="24"/>
-                <w:szCs w:val="24"/>
-              </w:rPr>
-            </w:pPr>
-          </w:p>
-          <w:p>
-            <w:pPr>
-              <w:spacing w:after="120"/>
-              <w:rPr>
-                <w:sz w:val="24"/>
-                <w:szCs w:val="24"/>
-              </w:rPr>
-            </w:pPr>
-          </w:p>
-          <w:p>
-            <w:pPr>
-              <w:spacing w:after="120"/>
-              <w:rPr>
-                <w:sz w:val="24"/>
-                <w:szCs w:val="24"/>
-              </w:rPr>
-            </w:pPr>
-          </w:p>
-        </w:tc>
-      </w:tr>
-    </w:tbl>
-    <w:p>
-      <w:pPr>
-        <w:pStyle w:val="Heading1"/>
-      </w:pPr>
-    </w:p>
-    <w:p/>
-    <w:p/>
-    <w:tbl>
-      <w:tblPr>
-        <w:tblW w:w="10080" w:type="dxa"/>
-        <w:jc w:val="center"/>
-        <w:tblLayout w:type="fixed"/>
-        <w:tblLook w:val="0400" w:firstRow="0" w:lastRow="0" w:firstColumn="0" w:lastColumn="0" w:noHBand="0" w:noVBand="1"/>
-      </w:tblPr>
-      <w:tblGrid>
-        <w:gridCol w:w="10080"/>
-      </w:tblGrid>
-      <w:tr>
-        <w:trPr>
-          <w:jc w:val="center"/>
-        </w:trPr>
-        <w:tc>
-          <w:tcPr>
-            <w:tcW w:w="10080" w:type="dxa"/>
-            <w:tcBorders>
-              <w:top w:val="single" w:sz="6" w:space="0" w:color="BFBFBF"/>
-              <w:left w:val="single" w:sz="6" w:space="0" w:color="BFBFBF"/>
-              <w:bottom w:val="single" w:sz="6" w:space="0" w:color="BFBFBF"/>
-              <w:right w:val="single" w:sz="6" w:space="0" w:color="BFBFBF"/>
-            </w:tcBorders>
-            <w:shd w:val="clear" w:color="auto" w:fill="F2F2F2"/>
-          </w:tcPr>
-          <w:p>
-            <w:pPr>
-              <w:rPr>
-                <w:sz w:val="24"/>
-                <w:szCs w:val="24"/>
-              </w:rPr>
-            </w:pPr>
-            <w:r>
-              <w:rPr>
-                <w:b/>
-                <w:bCs/>
-                <w:sz w:val="24"/>
-                <w:szCs w:val="24"/>
-              </w:rPr>
-              <w:t>Implementation evidence (e.g., screenshots, code snippets, retrieval outputs, notebook excerpts)</w:t>
-            </w:r>
-          </w:p>
-        </w:tc>
-      </w:tr>
-      <w:tr>
-        <w:trPr>
-          <w:jc w:val="center"/>
-        </w:trPr>
-        <w:tc>
-          <w:tcPr>
-            <w:tcW w:w="10080" w:type="dxa"/>
-            <w:tcBorders>
-              <w:top w:val="single" w:sz="6" w:space="0" w:color="BFBFBF"/>
-              <w:left w:val="single" w:sz="6" w:space="0" w:color="BFBFBF"/>
-              <w:bottom w:val="single" w:sz="6" w:space="0" w:color="BFBFBF"/>
-              <w:right w:val="single" w:sz="6" w:space="0" w:color="BFBFBF"/>
-            </w:tcBorders>
-          </w:tcPr>
-          <w:p>
-            <w:pPr>
-              <w:rPr>
-                <w:sz w:val="24"/>
-                <w:szCs w:val="24"/>
-              </w:rPr>
-            </w:pPr>
-            <w:r>
-              <w:rPr>
-                <w:sz w:val="24"/>
-                <w:szCs w:val="24"/>
-              </w:rPr>
-              <w:t>Response:</w:t>
-            </w:r>
-          </w:p>
-          <w:p>
-            <w:pPr>
-              <w:spacing w:after="120"/>
-              <w:rPr>
-                <w:sz w:val="24"/>
-                <w:szCs w:val="24"/>
-              </w:rPr>
-            </w:pPr>
-          </w:p>
-          <w:p>
-            <w:pPr>
-              <w:spacing w:after="120"/>
-              <w:rPr>
-                <w:sz w:val="24"/>
-                <w:szCs w:val="24"/>
-              </w:rPr>
-            </w:pPr>
-          </w:p>
-          <w:p>
-            <w:pPr>
-              <w:spacing w:after="120"/>
-              <w:rPr>
-                <w:sz w:val="24"/>
-                <w:szCs w:val="24"/>
-              </w:rPr>
-            </w:pPr>
-          </w:p>
-        </w:tc>
-      </w:tr>
-    </w:tbl>
-    <w:p/>
-    <w:p>
-      <w:pPr>
-        <w:pStyle w:val="Heading1"/>
-        <w:spacing w:after="0"/>
-      </w:pPr>
-      <w:r>
-        <w:t xml:space="preserve">Step </w:t>
-      </w:r>
-      <w:r>
-        <w:t xml:space="preserve">5. </w:t>
-      </w:r>
-      <w:r>
-        <w:t>Evaluation Results</w:t>
-      </w:r>
-    </w:p>
-    <w:p>
-      <w:pPr>
-        <w:rPr>
-          <w:rFonts w:eastAsia="Aptos"/>
-          <w:color w:val="000000"/>
-          <w:sz w:val="24"/>
-          <w:szCs w:val="24"/>
-        </w:rPr>
-      </w:pPr>
-      <w:r>
-        <w:rPr>
-          <w:rFonts w:eastAsia="Aptos"/>
-          <w:color w:val="000000"/>
-          <w:sz w:val="24"/>
-          <w:szCs w:val="24"/>
-        </w:rPr>
-        <w:t>Evaluate the updated system using the evaluation framework developed in previous modules.</w:t>
-      </w:r>
-    </w:p>
-    <w:p>
-      <w:pPr>
-        <w:pStyle w:val="ListParagraph"/>
-        <w:numPr>
-          <w:ilvl w:val="0"/>
-          <w:numId w:val="14"/>
-        </w:numPr>
-        <w:rPr>
-          <w:rFonts w:eastAsia="Aptos"/>
-          <w:color w:val="000000"/>
-          <w:sz w:val="24"/>
-          <w:szCs w:val="24"/>
-        </w:rPr>
-      </w:pPr>
-      <w:r>
-        <w:rPr>
-          <w:rFonts w:eastAsia="Aptos"/>
-          <w:color w:val="000000"/>
-          <w:sz w:val="24"/>
-          <w:szCs w:val="24"/>
-        </w:rPr>
-        <w:t>Present evaluation results.</w:t>
-      </w:r>
-    </w:p>
-    <w:p>
-      <w:pPr>
-        <w:pStyle w:val="ListParagraph"/>
-        <w:numPr>
-          <w:ilvl w:val="0"/>
-          <w:numId w:val="14"/>
-        </w:numPr>
-        <w:rPr>
-          <w:rFonts w:eastAsia="Aptos"/>
-          <w:color w:val="000000"/>
-          <w:sz w:val="24"/>
-          <w:szCs w:val="24"/>
-        </w:rPr>
-      </w:pPr>
-      <w:r>
-        <w:rPr>
-          <w:rFonts w:eastAsia="Aptos"/>
-          <w:color w:val="000000"/>
-          <w:sz w:val="24"/>
-          <w:szCs w:val="24"/>
-        </w:rPr>
-        <w:t>Compare performance against the baseline system.</w:t>
-      </w:r>
-    </w:p>
-    <w:p>
-      <w:pPr>
-        <w:pStyle w:val="ListParagraph"/>
-        <w:numPr>
-          <w:ilvl w:val="0"/>
-          <w:numId w:val="14"/>
-        </w:numPr>
-        <w:rPr>
-          <w:rFonts w:eastAsia="Aptos"/>
-          <w:color w:val="000000"/>
-          <w:sz w:val="24"/>
-          <w:szCs w:val="24"/>
-        </w:rPr>
-      </w:pPr>
-      <w:r>
-        <w:rPr>
-          <w:rFonts w:eastAsia="Aptos"/>
-          <w:color w:val="000000"/>
-          <w:sz w:val="24"/>
-          <w:szCs w:val="24"/>
-        </w:rPr>
-        <w:t>Include representative examples.</w:t>
-      </w:r>
-    </w:p>
-    <w:tbl>
-      <w:tblPr>
-        <w:tblStyle w:val="TableGrid"/>
-        <w:tblW w:w="0" w:type="auto"/>
-        <w:tblInd w:w="360" w:type="dxa"/>
-        <w:tblLook w:val="04A0" w:firstRow="1" w:lastRow="0" w:firstColumn="1" w:lastColumn="0" w:noHBand="0" w:noVBand="1"/>
-      </w:tblPr>
-      <w:tblGrid>
-        <w:gridCol w:w="3585"/>
-        <w:gridCol w:w="3575"/>
-        <w:gridCol w:w="3576"/>
-      </w:tblGrid>
-      <w:tr>
-        <w:tc>
-          <w:tcPr>
-            <w:tcW w:w="3698" w:type="dxa"/>
-            <w:shd w:val="clear" w:color="auto" w:fill="D9D9D9" w:themeFill="background1" w:themeFillShade="D9"/>
-          </w:tcPr>
-          <w:p>
-            <w:pPr>
-              <w:jc w:val="center"/>
-              <w:rPr>
-                <w:rFonts w:eastAsia="Aptos"/>
-                <w:b/>
-                <w:bCs/>
-                <w:color w:val="000000"/>
-                <w:sz w:val="24"/>
-                <w:szCs w:val="24"/>
-              </w:rPr>
-            </w:pPr>
-            <w:r>
-              <w:rPr>
-                <w:rFonts w:eastAsia="Aptos"/>
-                <w:b/>
-                <w:bCs/>
-                <w:color w:val="000000"/>
-                <w:sz w:val="24"/>
-                <w:szCs w:val="24"/>
-              </w:rPr>
-              <w:t>Evaluation Metric</w:t>
-            </w:r>
-          </w:p>
-        </w:tc>
-        <w:tc>
-          <w:tcPr>
-            <w:tcW w:w="3699" w:type="dxa"/>
-            <w:shd w:val="clear" w:color="auto" w:fill="D9D9D9" w:themeFill="background1" w:themeFillShade="D9"/>
-          </w:tcPr>
-          <w:p>
-            <w:pPr>
-              <w:jc w:val="center"/>
-              <w:rPr>
-                <w:rFonts w:eastAsia="Aptos"/>
-                <w:b/>
-                <w:bCs/>
-                <w:color w:val="000000"/>
-                <w:sz w:val="24"/>
-                <w:szCs w:val="24"/>
-              </w:rPr>
-            </w:pPr>
-            <w:r>
-              <w:rPr>
-                <w:rFonts w:eastAsia="Aptos"/>
-                <w:b/>
-                <w:bCs/>
-                <w:color w:val="000000"/>
-                <w:sz w:val="24"/>
-                <w:szCs w:val="24"/>
-              </w:rPr>
-              <w:t>Baseline Result</w:t>
-            </w:r>
-          </w:p>
-        </w:tc>
-        <w:tc>
-          <w:tcPr>
-            <w:tcW w:w="3699" w:type="dxa"/>
-            <w:shd w:val="clear" w:color="auto" w:fill="D9D9D9" w:themeFill="background1" w:themeFillShade="D9"/>
-          </w:tcPr>
-          <w:p>
-            <w:pPr>
-              <w:jc w:val="center"/>
-              <w:rPr>
-                <w:rFonts w:eastAsia="Aptos"/>
-                <w:b/>
-                <w:bCs/>
-                <w:color w:val="000000"/>
-                <w:sz w:val="24"/>
-                <w:szCs w:val="24"/>
-              </w:rPr>
-            </w:pPr>
-            <w:r>
-              <w:rPr>
-                <w:rFonts w:eastAsia="Aptos"/>
-                <w:b/>
-                <w:bCs/>
-                <w:color w:val="000000"/>
-                <w:sz w:val="24"/>
-                <w:szCs w:val="24"/>
-              </w:rPr>
-              <w:t>Updated Result</w:t>
-            </w:r>
-          </w:p>
-        </w:tc>
-      </w:tr>
-      <w:tr>
-        <w:tc>
-          <w:tcPr>
-            <w:tcW w:w="3698" w:type="dxa"/>
-          </w:tcPr>
-          <w:p>
-            <w:pPr>
-              <w:rPr>
-                <w:rFonts w:eastAsia="Aptos"/>
-                <w:b/>
-                <w:bCs/>
-                <w:color w:val="000000"/>
-                <w:sz w:val="24"/>
-                <w:szCs w:val="24"/>
-              </w:rPr>
-            </w:pPr>
-          </w:p>
-        </w:tc>
-        <w:tc>
-          <w:tcPr>
-            <w:tcW w:w="3699" w:type="dxa"/>
-          </w:tcPr>
-          <w:p>
-            <w:pPr>
-              <w:rPr>
-                <w:rFonts w:eastAsia="Aptos"/>
-                <w:b/>
-                <w:bCs/>
-                <w:color w:val="000000"/>
-                <w:sz w:val="24"/>
-                <w:szCs w:val="24"/>
-              </w:rPr>
-            </w:pPr>
-          </w:p>
-        </w:tc>
-        <w:tc>
-          <w:tcPr>
-            <w:tcW w:w="3699" w:type="dxa"/>
-          </w:tcPr>
-          <w:p>
-            <w:pPr>
-              <w:rPr>
-                <w:rFonts w:eastAsia="Aptos"/>
-                <w:b/>
-                <w:bCs/>
-                <w:color w:val="000000"/>
-                <w:sz w:val="24"/>
-                <w:szCs w:val="24"/>
-              </w:rPr>
-            </w:pPr>
-          </w:p>
-        </w:tc>
-      </w:tr>
-      <w:tr>
-        <w:tc>
-          <w:tcPr>
-            <w:tcW w:w="3698" w:type="dxa"/>
-          </w:tcPr>
-          <w:p>
-            <w:pPr>
-              <w:rPr>
-                <w:rFonts w:eastAsia="Aptos"/>
-                <w:b/>
-                <w:bCs/>
-                <w:color w:val="000000"/>
-                <w:sz w:val="24"/>
-                <w:szCs w:val="24"/>
-              </w:rPr>
-            </w:pPr>
-          </w:p>
-        </w:tc>
-        <w:tc>
-          <w:tcPr>
-            <w:tcW w:w="3699" w:type="dxa"/>
-          </w:tcPr>
-          <w:p>
-            <w:pPr>
-              <w:rPr>
-                <w:rFonts w:eastAsia="Aptos"/>
-                <w:b/>
-                <w:bCs/>
-                <w:color w:val="000000"/>
-                <w:sz w:val="24"/>
-                <w:szCs w:val="24"/>
-              </w:rPr>
-            </w:pPr>
-          </w:p>
-        </w:tc>
-        <w:tc>
-          <w:tcPr>
-            <w:tcW w:w="3699" w:type="dxa"/>
-          </w:tcPr>
-          <w:p>
-            <w:pPr>
-              <w:rPr>
-                <w:rFonts w:eastAsia="Aptos"/>
-                <w:b/>
-                <w:bCs/>
-                <w:color w:val="000000"/>
-                <w:sz w:val="24"/>
-                <w:szCs w:val="24"/>
-              </w:rPr>
-            </w:pPr>
-          </w:p>
-        </w:tc>
-      </w:tr>
-    </w:tbl>
-    <w:p>
-      <w:pPr>
-        <w:ind w:left="360"/>
-        <w:rPr>
-          <w:rFonts w:eastAsia="Aptos"/>
-          <w:color w:val="000000"/>
-          <w:sz w:val="24"/>
-          <w:szCs w:val="24"/>
-        </w:rPr>
-      </w:pPr>
-    </w:p>
-    <w:tbl>
-      <w:tblPr>
-        <w:tblW w:w="10080" w:type="dxa"/>
-        <w:jc w:val="center"/>
-        <w:tblLayout w:type="fixed"/>
-        <w:tblLook w:val="0400" w:firstRow="0" w:lastRow="0" w:firstColumn="0" w:lastColumn="0" w:noHBand="0" w:noVBand="1"/>
-      </w:tblPr>
-      <w:tblGrid>
-        <w:gridCol w:w="10080"/>
-      </w:tblGrid>
-      <w:tr>
-        <w:trPr>
-          <w:jc w:val="center"/>
-        </w:trPr>
-        <w:tc>
-          <w:tcPr>
-            <w:tcW w:w="10080" w:type="dxa"/>
-            <w:tcBorders>
-              <w:top w:val="single" w:sz="6" w:space="0" w:color="BFBFBF"/>
-              <w:left w:val="single" w:sz="6" w:space="0" w:color="BFBFBF"/>
-              <w:bottom w:val="single" w:sz="6" w:space="0" w:color="BFBFBF"/>
-              <w:right w:val="single" w:sz="6" w:space="0" w:color="BFBFBF"/>
-            </w:tcBorders>
-            <w:shd w:val="clear" w:color="auto" w:fill="F2F2F2"/>
-          </w:tcPr>
-          <w:p>
-            <w:pPr>
-              <w:rPr>
-                <w:sz w:val="24"/>
-                <w:szCs w:val="24"/>
-              </w:rPr>
-            </w:pPr>
-            <w:r>
-              <w:rPr>
-                <w:b/>
-                <w:bCs/>
-                <w:sz w:val="24"/>
-                <w:szCs w:val="24"/>
-              </w:rPr>
-              <w:t>Example 1: Query, retrieved information, and result</w:t>
-            </w:r>
-          </w:p>
-        </w:tc>
-      </w:tr>
-      <w:tr>
-        <w:trPr>
-          <w:jc w:val="center"/>
-        </w:trPr>
-        <w:tc>
-          <w:tcPr>
-            <w:tcW w:w="10080" w:type="dxa"/>
-            <w:tcBorders>
-              <w:top w:val="single" w:sz="6" w:space="0" w:color="BFBFBF"/>
-              <w:left w:val="single" w:sz="6" w:space="0" w:color="BFBFBF"/>
-              <w:bottom w:val="single" w:sz="6" w:space="0" w:color="BFBFBF"/>
-              <w:right w:val="single" w:sz="6" w:space="0" w:color="BFBFBF"/>
-            </w:tcBorders>
-          </w:tcPr>
-          <w:p>
-            <w:pPr>
-              <w:rPr>
-                <w:sz w:val="24"/>
-                <w:szCs w:val="24"/>
-              </w:rPr>
-            </w:pPr>
-            <w:r>
-              <w:rPr>
-                <w:sz w:val="24"/>
-                <w:szCs w:val="24"/>
-              </w:rPr>
-              <w:t>Response:</w:t>
-            </w:r>
-          </w:p>
-          <w:p>
-            <w:pPr>
-              <w:spacing w:after="120"/>
-              <w:rPr>
-                <w:sz w:val="24"/>
-                <w:szCs w:val="24"/>
-              </w:rPr>
-            </w:pPr>
-          </w:p>
-          <w:p>
-            <w:pPr>
-              <w:spacing w:after="120"/>
-              <w:rPr>
-                <w:sz w:val="24"/>
-                <w:szCs w:val="24"/>
-              </w:rPr>
-            </w:pPr>
-          </w:p>
-          <w:p>
-            <w:pPr>
-              <w:spacing w:after="120"/>
-              <w:rPr>
-                <w:sz w:val="24"/>
-                <w:szCs w:val="24"/>
-              </w:rPr>
-            </w:pPr>
+              <w:t>I kept my existing hybrid retriever, which combines keyword and vector search, and added query decomposition and graph retrieval around it.</w:t>
+            </w:r>
+          </w:p>
+          <w:p>
+            <w:r>
+              <w:t>With decomposition, the model breaks a question into smaller searches. The system combines their results, removes duplicate articles, and adds each article’s scores across the searches to select the top results.</w:t>
+            </w:r>
+          </w:p>
+          <w:p>
+            <w:r>
+              <w:lastRenderedPageBreak/>
+              <w:t>I also created a reusable graph_retriever.py module. It reads hyperlinks from my saved Wikipedia HTML and builds connections between articles indexed in Chroma. It keeps two primary search results, follows their links one hop, and selects an additional article using BM25 scoring. The answer prompt identifies which documents are primary results and which were found through links.</w:t>
+            </w:r>
+          </w:p>
+          <w:p>
+            <w:r>
+              <w:t>Unlike the baseline’s single search, the updated system can search different parts of a question and follow article relationships. Checkpoint 4.1 compares these approaches separately and together, using a shared evaluation module and a three-document limit.</w:t>
+            </w:r>
           </w:p>
         </w:tc>
       </w:tr>
@@ -2381,7 +1774,7 @@
                 <w:sz w:val="24"/>
                 <w:szCs w:val="24"/>
               </w:rPr>
-              <w:t>Example 2: Query, retrieved information, and result</w:t>
+              <w:t>Implementation evidence (e.g., screenshots, code snippets, retrieval outputs, notebook excerpts)</w:t>
             </w:r>
           </w:p>
         </w:tc>
@@ -2403,44 +1796,737 @@
           <w:p>
             <w:pPr>
               <w:rPr>
+                <w:lang w:eastAsia="en-US"/>
+              </w:rPr>
+            </w:pPr>
+            <w:r>
+              <w:t>The graph built from my corpus contains 2,423 articles and 25,982 connections. The comparison code uses existing search results as starting points:</w:t>
+            </w:r>
+          </w:p>
+          <w:p>
+            <w:pPr>
+              <w:pStyle w:val="HTMLPreformatted"/>
+              <w:rPr>
+                <w:rStyle w:val="HTMLCode"/>
+              </w:rPr>
+            </w:pPr>
+            <w:proofErr w:type="spellStart"/>
+            <w:r>
+              <w:rPr>
+                <w:rStyle w:val="HTMLCode"/>
+              </w:rPr>
+              <w:t>graph_hits</w:t>
+            </w:r>
+            <w:proofErr w:type="spellEnd"/>
+            <w:r>
+              <w:rPr>
+                <w:rStyle w:val="HTMLCode"/>
+              </w:rPr>
+              <w:t xml:space="preserve"> = </w:t>
+            </w:r>
+            <w:proofErr w:type="spellStart"/>
+            <w:r>
+              <w:rPr>
+                <w:rStyle w:val="HTMLCode"/>
+              </w:rPr>
+              <w:t>graph_</w:t>
+            </w:r>
+            <w:proofErr w:type="gramStart"/>
+            <w:r>
+              <w:rPr>
+                <w:rStyle w:val="HTMLCode"/>
+              </w:rPr>
+              <w:t>retriever.getTopK</w:t>
+            </w:r>
+            <w:proofErr w:type="spellEnd"/>
+            <w:proofErr w:type="gramEnd"/>
+            <w:r>
+              <w:rPr>
+                <w:rStyle w:val="HTMLCode"/>
+              </w:rPr>
+              <w:t>(</w:t>
+            </w:r>
+          </w:p>
+          <w:p>
+            <w:pPr>
+              <w:pStyle w:val="HTMLPreformatted"/>
+              <w:rPr>
+                <w:rStyle w:val="HTMLCode"/>
+              </w:rPr>
+            </w:pPr>
+            <w:r>
+              <w:rPr>
+                <w:rStyle w:val="HTMLCode"/>
+              </w:rPr>
+              <w:t xml:space="preserve">    query, TOP_K, </w:t>
+            </w:r>
+            <w:proofErr w:type="spellStart"/>
+            <w:r>
+              <w:rPr>
+                <w:rStyle w:val="HTMLCode"/>
+              </w:rPr>
+              <w:t>seed_hits</w:t>
+            </w:r>
+            <w:proofErr w:type="spellEnd"/>
+            <w:r>
+              <w:rPr>
+                <w:rStyle w:val="HTMLCode"/>
+              </w:rPr>
+              <w:t>=base</w:t>
+            </w:r>
+          </w:p>
+          <w:p>
+            <w:pPr>
+              <w:pStyle w:val="HTMLPreformatted"/>
+              <w:rPr>
+                <w:rStyle w:val="HTMLCode"/>
+              </w:rPr>
+            </w:pPr>
+            <w:r>
+              <w:rPr>
+                <w:rStyle w:val="HTMLCode"/>
+              </w:rPr>
+              <w:t>)</w:t>
+            </w:r>
+          </w:p>
+          <w:p>
+            <w:pPr>
+              <w:pStyle w:val="HTMLPreformatted"/>
+              <w:rPr>
+                <w:rStyle w:val="HTMLCode"/>
+              </w:rPr>
+            </w:pPr>
+          </w:p>
+          <w:p>
+            <w:pPr>
+              <w:pStyle w:val="HTMLPreformatted"/>
+              <w:rPr>
+                <w:rStyle w:val="HTMLCode"/>
+              </w:rPr>
+            </w:pPr>
+            <w:r>
+              <w:rPr>
+                <w:rStyle w:val="HTMLCode"/>
+              </w:rPr>
+              <w:t xml:space="preserve">combined = </w:t>
+            </w:r>
+            <w:proofErr w:type="spellStart"/>
+            <w:r>
+              <w:rPr>
+                <w:rStyle w:val="HTMLCode"/>
+              </w:rPr>
+              <w:t>graph_</w:t>
+            </w:r>
+            <w:proofErr w:type="gramStart"/>
+            <w:r>
+              <w:rPr>
+                <w:rStyle w:val="HTMLCode"/>
+              </w:rPr>
+              <w:t>retriever.getTopK</w:t>
+            </w:r>
+            <w:proofErr w:type="spellEnd"/>
+            <w:proofErr w:type="gramEnd"/>
+            <w:r>
+              <w:rPr>
+                <w:rStyle w:val="HTMLCode"/>
+              </w:rPr>
+              <w:t>(</w:t>
+            </w:r>
+          </w:p>
+          <w:p>
+            <w:pPr>
+              <w:pStyle w:val="HTMLPreformatted"/>
+              <w:rPr>
+                <w:rStyle w:val="HTMLCode"/>
+              </w:rPr>
+            </w:pPr>
+            <w:r>
+              <w:rPr>
+                <w:rStyle w:val="HTMLCode"/>
+              </w:rPr>
+              <w:t xml:space="preserve">    query, TOP_K, </w:t>
+            </w:r>
+            <w:proofErr w:type="spellStart"/>
+            <w:r>
+              <w:rPr>
+                <w:rStyle w:val="HTMLCode"/>
+              </w:rPr>
+              <w:t>seed_hits</w:t>
+            </w:r>
+            <w:proofErr w:type="spellEnd"/>
+            <w:r>
+              <w:rPr>
+                <w:rStyle w:val="HTMLCode"/>
+              </w:rPr>
+              <w:t>=multi</w:t>
+            </w:r>
+          </w:p>
+          <w:p>
+            <w:pPr>
+              <w:pStyle w:val="HTMLPreformatted"/>
+            </w:pPr>
+            <w:r>
+              <w:rPr>
+                <w:rStyle w:val="HTMLCode"/>
+              </w:rPr>
+              <w:t>)</w:t>
+            </w:r>
+          </w:p>
+          <w:p>
+            <w:pPr>
+              <w:spacing w:after="120"/>
+              <w:rPr>
                 <w:sz w:val="24"/>
                 <w:szCs w:val="24"/>
               </w:rPr>
             </w:pPr>
-            <w:r>
-              <w:rPr>
+          </w:p>
+          <w:p>
+            <w:pPr>
+              <w:rPr>
+                <w:lang w:eastAsia="en-US"/>
+              </w:rPr>
+            </w:pPr>
+            <w:r>
+              <w:t>For the 2026 NFL draft question, the graph run returned:</w:t>
+            </w:r>
+          </w:p>
+          <w:p>
+            <w:pPr>
+              <w:pStyle w:val="HTMLPreformatted"/>
+              <w:rPr>
+                <w:rStyle w:val="HTMLCode"/>
+              </w:rPr>
+            </w:pPr>
+            <w:proofErr w:type="spellStart"/>
+            <w:r>
+              <w:rPr>
+                <w:rStyle w:val="HTMLCode"/>
+              </w:rPr>
+              <w:t>Baltimore_Ravens</w:t>
+            </w:r>
+            <w:proofErr w:type="spellEnd"/>
+            <w:r>
+              <w:rPr>
+                <w:rStyle w:val="HTMLCode"/>
+              </w:rPr>
+              <w:t xml:space="preserve"> — primary: bm25</w:t>
+            </w:r>
+          </w:p>
+          <w:p>
+            <w:pPr>
+              <w:pStyle w:val="HTMLPreformatted"/>
+              <w:rPr>
+                <w:rStyle w:val="HTMLCode"/>
+              </w:rPr>
+            </w:pPr>
+            <w:r>
+              <w:rPr>
+                <w:rStyle w:val="HTMLCode"/>
+              </w:rPr>
+              <w:t>2026_NFL_draft — primary: vector</w:t>
+            </w:r>
+          </w:p>
+          <w:p>
+            <w:pPr>
+              <w:pStyle w:val="HTMLPreformatted"/>
+              <w:rPr>
+                <w:rStyle w:val="HTMLCode"/>
+              </w:rPr>
+            </w:pPr>
+            <w:proofErr w:type="spellStart"/>
+            <w:r>
+              <w:rPr>
+                <w:rStyle w:val="HTMLCode"/>
+              </w:rPr>
+              <w:t>National_Football_League</w:t>
+            </w:r>
+            <w:proofErr w:type="spellEnd"/>
+            <w:r>
+              <w:rPr>
+                <w:rStyle w:val="HTMLCode"/>
+              </w:rPr>
+              <w:t xml:space="preserve"> — context linked from</w:t>
+            </w:r>
+          </w:p>
+          <w:p>
+            <w:pPr>
+              <w:pStyle w:val="HTMLPreformatted"/>
+            </w:pPr>
+            <w:r>
+              <w:rPr>
+                <w:rStyle w:val="HTMLCode"/>
+              </w:rPr>
+              <w:t xml:space="preserve">    </w:t>
+            </w:r>
+            <w:proofErr w:type="spellStart"/>
+            <w:r>
+              <w:rPr>
+                <w:rStyle w:val="HTMLCode"/>
+              </w:rPr>
+              <w:t>Baltimore_Ravens</w:t>
+            </w:r>
+            <w:proofErr w:type="spellEnd"/>
+            <w:r>
+              <w:rPr>
+                <w:rStyle w:val="HTMLCode"/>
+              </w:rPr>
+              <w:t xml:space="preserve"> and 2026_NFL_draft</w:t>
+            </w:r>
+          </w:p>
+          <w:p>
+            <w:pPr>
+              <w:rPr>
+                <w:lang w:eastAsia="en-US"/>
+              </w:rPr>
+            </w:pPr>
+            <w:r>
+              <w:br/>
+            </w:r>
+            <w:r>
+              <w:t>The baseline had returned 2021_NBA_draft as its third article. This output shows that graph retrieval changed the additional context and recorded the relationships used to find it. Both answers passed evaluation, so this example demonstrates that the implementation works, rather than proving an improvement in answer accuracy.</w:t>
+            </w:r>
+          </w:p>
+        </w:tc>
+      </w:tr>
+    </w:tbl>
+    <w:p/>
+    <w:p>
+      <w:pPr>
+        <w:pStyle w:val="Heading1"/>
+        <w:spacing w:after="0"/>
+      </w:pPr>
+    </w:p>
+    <w:p>
+      <w:pPr>
+        <w:pStyle w:val="Heading1"/>
+        <w:spacing w:after="0"/>
+      </w:pPr>
+      <w:r>
+        <w:lastRenderedPageBreak/>
+        <w:t xml:space="preserve">Step </w:t>
+      </w:r>
+      <w:r>
+        <w:t xml:space="preserve">5. </w:t>
+      </w:r>
+      <w:r>
+        <w:t>Evaluation Results</w:t>
+      </w:r>
+    </w:p>
+    <w:p>
+      <w:pPr>
+        <w:rPr>
+          <w:rFonts w:eastAsia="Aptos"/>
+          <w:color w:val="000000"/>
+          <w:sz w:val="24"/>
+          <w:szCs w:val="24"/>
+        </w:rPr>
+      </w:pPr>
+      <w:r>
+        <w:rPr>
+          <w:rFonts w:eastAsia="Aptos"/>
+          <w:color w:val="000000"/>
+          <w:sz w:val="24"/>
+          <w:szCs w:val="24"/>
+        </w:rPr>
+        <w:t>Evaluate the updated system using the evaluation framework developed in previous modules.</w:t>
+      </w:r>
+    </w:p>
+    <w:p>
+      <w:pPr>
+        <w:pStyle w:val="ListParagraph"/>
+        <w:numPr>
+          <w:ilvl w:val="0"/>
+          <w:numId w:val="14"/>
+        </w:numPr>
+        <w:rPr>
+          <w:rFonts w:eastAsia="Aptos"/>
+          <w:color w:val="000000"/>
+          <w:sz w:val="24"/>
+          <w:szCs w:val="24"/>
+        </w:rPr>
+      </w:pPr>
+      <w:r>
+        <w:rPr>
+          <w:rFonts w:eastAsia="Aptos"/>
+          <w:color w:val="000000"/>
+          <w:sz w:val="24"/>
+          <w:szCs w:val="24"/>
+        </w:rPr>
+        <w:t>Present evaluation results.</w:t>
+      </w:r>
+    </w:p>
+    <w:p>
+      <w:pPr>
+        <w:pStyle w:val="ListParagraph"/>
+        <w:numPr>
+          <w:ilvl w:val="0"/>
+          <w:numId w:val="14"/>
+        </w:numPr>
+        <w:rPr>
+          <w:rFonts w:eastAsia="Aptos"/>
+          <w:color w:val="000000"/>
+          <w:sz w:val="24"/>
+          <w:szCs w:val="24"/>
+        </w:rPr>
+      </w:pPr>
+      <w:r>
+        <w:rPr>
+          <w:rFonts w:eastAsia="Aptos"/>
+          <w:color w:val="000000"/>
+          <w:sz w:val="24"/>
+          <w:szCs w:val="24"/>
+        </w:rPr>
+        <w:t>Compare performance against the baseline system.</w:t>
+      </w:r>
+    </w:p>
+    <w:p>
+      <w:pPr>
+        <w:pStyle w:val="ListParagraph"/>
+        <w:numPr>
+          <w:ilvl w:val="0"/>
+          <w:numId w:val="14"/>
+        </w:numPr>
+        <w:rPr>
+          <w:rFonts w:eastAsia="Aptos"/>
+          <w:color w:val="000000"/>
+          <w:sz w:val="24"/>
+          <w:szCs w:val="24"/>
+        </w:rPr>
+      </w:pPr>
+      <w:r>
+        <w:rPr>
+          <w:rFonts w:eastAsia="Aptos"/>
+          <w:color w:val="000000"/>
+          <w:sz w:val="24"/>
+          <w:szCs w:val="24"/>
+        </w:rPr>
+        <w:t>Include representative examples.</w:t>
+      </w:r>
+    </w:p>
+    <w:tbl>
+      <w:tblPr>
+        <w:tblStyle w:val="TableGrid"/>
+        <w:tblW w:w="0" w:type="auto"/>
+        <w:tblInd w:w="360" w:type="dxa"/>
+        <w:tblLook w:val="04A0" w:firstRow="1" w:lastRow="0" w:firstColumn="1" w:lastColumn="0" w:noHBand="0" w:noVBand="1"/>
+      </w:tblPr>
+      <w:tblGrid>
+        <w:gridCol w:w="3558"/>
+        <w:gridCol w:w="3578"/>
+        <w:gridCol w:w="3600"/>
+      </w:tblGrid>
+      <w:tr>
+        <w:tc>
+          <w:tcPr>
+            <w:tcW w:w="3698" w:type="dxa"/>
+            <w:shd w:val="clear" w:color="auto" w:fill="D9D9D9" w:themeFill="background1" w:themeFillShade="D9"/>
+          </w:tcPr>
+          <w:p>
+            <w:pPr>
+              <w:jc w:val="center"/>
+              <w:rPr>
+                <w:rFonts w:eastAsia="Aptos"/>
+                <w:b/>
+                <w:bCs/>
+                <w:color w:val="000000"/>
                 <w:sz w:val="24"/>
                 <w:szCs w:val="24"/>
               </w:rPr>
-              <w:t>Response:</w:t>
-            </w:r>
-          </w:p>
-          <w:p>
-            <w:pPr>
-              <w:spacing w:after="120"/>
-              <w:rPr>
+            </w:pPr>
+            <w:r>
+              <w:rPr>
+                <w:rFonts w:eastAsia="Aptos"/>
+                <w:b/>
+                <w:bCs/>
+                <w:color w:val="000000"/>
                 <w:sz w:val="24"/>
                 <w:szCs w:val="24"/>
               </w:rPr>
-            </w:pPr>
-          </w:p>
+              <w:t>Evaluation Metric</w:t>
+            </w:r>
+          </w:p>
+        </w:tc>
+        <w:tc>
+          <w:tcPr>
+            <w:tcW w:w="3699" w:type="dxa"/>
+            <w:shd w:val="clear" w:color="auto" w:fill="D9D9D9" w:themeFill="background1" w:themeFillShade="D9"/>
+          </w:tcPr>
           <w:p>
             <w:pPr>
-              <w:spacing w:after="120"/>
-              <w:rPr>
+              <w:jc w:val="center"/>
+              <w:rPr>
+                <w:rFonts w:eastAsia="Aptos"/>
+                <w:b/>
+                <w:bCs/>
+                <w:color w:val="000000"/>
                 <w:sz w:val="24"/>
                 <w:szCs w:val="24"/>
               </w:rPr>
             </w:pPr>
-          </w:p>
-          <w:p>
-            <w:pPr>
-              <w:spacing w:after="120"/>
-              <w:rPr>
+            <w:r>
+              <w:rPr>
+                <w:rFonts w:eastAsia="Aptos"/>
+                <w:b/>
+                <w:bCs/>
+                <w:color w:val="000000"/>
                 <w:sz w:val="24"/>
                 <w:szCs w:val="24"/>
               </w:rPr>
+              <w:t>Baseline Result</w:t>
+            </w:r>
+          </w:p>
+        </w:tc>
+        <w:tc>
+          <w:tcPr>
+            <w:tcW w:w="3699" w:type="dxa"/>
+            <w:shd w:val="clear" w:color="auto" w:fill="D9D9D9" w:themeFill="background1" w:themeFillShade="D9"/>
+          </w:tcPr>
+          <w:p>
+            <w:pPr>
+              <w:jc w:val="center"/>
+              <w:rPr>
+                <w:rFonts w:eastAsia="Aptos"/>
+                <w:b/>
+                <w:bCs/>
+                <w:color w:val="000000"/>
+                <w:sz w:val="24"/>
+                <w:szCs w:val="24"/>
+              </w:rPr>
             </w:pPr>
+            <w:r>
+              <w:rPr>
+                <w:rFonts w:eastAsia="Aptos"/>
+                <w:b/>
+                <w:bCs/>
+                <w:color w:val="000000"/>
+                <w:sz w:val="24"/>
+                <w:szCs w:val="24"/>
+              </w:rPr>
+              <w:t>Updated Result</w:t>
+            </w:r>
+          </w:p>
+        </w:tc>
+      </w:tr>
+      <w:tr>
+        <w:tc>
+          <w:tcPr>
+            <w:tcW w:w="3698" w:type="dxa"/>
+          </w:tcPr>
+          <w:p>
+            <w:pPr>
+              <w:rPr>
+                <w:rFonts w:eastAsia="Aptos"/>
+                <w:b/>
+                <w:bCs/>
+                <w:color w:val="000000"/>
+                <w:sz w:val="24"/>
+                <w:szCs w:val="24"/>
+              </w:rPr>
+            </w:pPr>
+            <w:r>
+              <w:t>LLM-judge answer pass rate</w:t>
+            </w:r>
+          </w:p>
+        </w:tc>
+        <w:tc>
+          <w:tcPr>
+            <w:tcW w:w="3699" w:type="dxa"/>
+          </w:tcPr>
+          <w:p>
+            <w:pPr>
+              <w:rPr>
+                <w:rFonts w:eastAsia="Aptos"/>
+                <w:b/>
+                <w:bCs/>
+                <w:color w:val="000000"/>
+                <w:sz w:val="24"/>
+                <w:szCs w:val="24"/>
+              </w:rPr>
+            </w:pPr>
+            <w:r>
+              <w:t>3/3 (100%)</w:t>
+            </w:r>
+          </w:p>
+        </w:tc>
+        <w:tc>
+          <w:tcPr>
+            <w:tcW w:w="3699" w:type="dxa"/>
+          </w:tcPr>
+          <w:p>
+            <w:pPr>
+              <w:rPr>
+                <w:rFonts w:eastAsia="Aptos"/>
+                <w:b/>
+                <w:bCs/>
+                <w:color w:val="000000"/>
+                <w:sz w:val="24"/>
+                <w:szCs w:val="24"/>
+              </w:rPr>
+            </w:pPr>
+            <w:r>
+              <w:t>Graph: 3/3 (100%); Decomposition: 2/3 (67%); Combined: 2/3 (67%)</w:t>
+            </w:r>
+          </w:p>
+        </w:tc>
+      </w:tr>
+      <w:tr>
+        <w:tc>
+          <w:tcPr>
+            <w:tcW w:w="3698" w:type="dxa"/>
+          </w:tcPr>
+          <w:p>
+            <w:pPr>
+              <w:rPr>
+                <w:rFonts w:eastAsia="Aptos"/>
+                <w:b/>
+                <w:bCs/>
+                <w:color w:val="000000"/>
+                <w:sz w:val="24"/>
+                <w:szCs w:val="24"/>
+              </w:rPr>
+            </w:pPr>
+            <w:r>
+              <w:t>Retrieved context relevance (manual review)</w:t>
+            </w:r>
+          </w:p>
+        </w:tc>
+        <w:tc>
+          <w:tcPr>
+            <w:tcW w:w="3699" w:type="dxa"/>
+          </w:tcPr>
+          <w:p>
+            <w:pPr>
+              <w:rPr>
+                <w:rFonts w:eastAsia="Aptos"/>
+                <w:b/>
+                <w:bCs/>
+                <w:color w:val="000000"/>
+                <w:sz w:val="24"/>
+                <w:szCs w:val="24"/>
+              </w:rPr>
+            </w:pPr>
+            <w:r>
+              <w:t>Correct source retrieved, but unnecessary articles also included</w:t>
+            </w:r>
+          </w:p>
+        </w:tc>
+        <w:tc>
+          <w:tcPr>
+            <w:tcW w:w="3699" w:type="dxa"/>
+          </w:tcPr>
+          <w:p>
+            <w:r>
+              <w:t>Graph changed supporting articles, but unnecessary context remained; no clear improvement</w:t>
+            </w:r>
+          </w:p>
+        </w:tc>
+      </w:tr>
+    </w:tbl>
+    <w:p>
+      <w:pPr>
+        <w:ind w:left="360"/>
+        <w:rPr>
+          <w:rFonts w:eastAsia="Aptos"/>
+          <w:color w:val="000000"/>
+          <w:sz w:val="24"/>
+          <w:szCs w:val="24"/>
+        </w:rPr>
+      </w:pPr>
+    </w:p>
+    <w:tbl>
+      <w:tblPr>
+        <w:tblW w:w="10080" w:type="dxa"/>
+        <w:jc w:val="center"/>
+        <w:tblLayout w:type="fixed"/>
+        <w:tblLook w:val="0400" w:firstRow="0" w:lastRow="0" w:firstColumn="0" w:lastColumn="0" w:noHBand="0" w:noVBand="1"/>
+      </w:tblPr>
+      <w:tblGrid>
+        <w:gridCol w:w="10080"/>
+      </w:tblGrid>
+      <w:tr>
+        <w:trPr>
+          <w:jc w:val="center"/>
+        </w:trPr>
+        <w:tc>
+          <w:tcPr>
+            <w:tcW w:w="10080" w:type="dxa"/>
+            <w:tcBorders>
+              <w:top w:val="single" w:sz="6" w:space="0" w:color="BFBFBF"/>
+              <w:left w:val="single" w:sz="6" w:space="0" w:color="BFBFBF"/>
+              <w:bottom w:val="single" w:sz="6" w:space="0" w:color="BFBFBF"/>
+              <w:right w:val="single" w:sz="6" w:space="0" w:color="BFBFBF"/>
+            </w:tcBorders>
+            <w:shd w:val="clear" w:color="auto" w:fill="F2F2F2"/>
+          </w:tcPr>
+          <w:p>
+            <w:pPr>
+              <w:rPr>
+                <w:sz w:val="24"/>
+                <w:szCs w:val="24"/>
+              </w:rPr>
+            </w:pPr>
+            <w:r>
+              <w:rPr>
+                <w:b/>
+                <w:bCs/>
+                <w:sz w:val="24"/>
+                <w:szCs w:val="24"/>
+              </w:rPr>
+              <w:t>Example 1: Query, retrieved information, and result</w:t>
+            </w:r>
+          </w:p>
+        </w:tc>
+      </w:tr>
+      <w:tr>
+        <w:trPr>
+          <w:jc w:val="center"/>
+        </w:trPr>
+        <w:tc>
+          <w:tcPr>
+            <w:tcW w:w="10080" w:type="dxa"/>
+            <w:tcBorders>
+              <w:top w:val="single" w:sz="6" w:space="0" w:color="BFBFBF"/>
+              <w:left w:val="single" w:sz="6" w:space="0" w:color="BFBFBF"/>
+              <w:bottom w:val="single" w:sz="6" w:space="0" w:color="BFBFBF"/>
+              <w:right w:val="single" w:sz="6" w:space="0" w:color="BFBFBF"/>
+            </w:tcBorders>
+          </w:tcPr>
+          <w:p>
+            <w:pPr>
+              <w:rPr>
+                <w:lang w:eastAsia="en-US"/>
+              </w:rPr>
+            </w:pPr>
+            <w:r>
+              <w:t xml:space="preserve">For “Who were the first three players drafted in the 2026 NFL draft?”, the baseline retrieved </w:t>
+            </w:r>
+            <w:proofErr w:type="spellStart"/>
+            <w:r>
+              <w:t>Baltimore_Ravens</w:t>
+            </w:r>
+            <w:proofErr w:type="spellEnd"/>
+            <w:r>
+              <w:t>, 2026_NFL_draft, and 2021_NBA_draft.</w:t>
+            </w:r>
+          </w:p>
+          <w:p>
+            <w:r>
+              <w:t xml:space="preserve">Graph retrieval kept the first two articles and replaced the NBA article with </w:t>
+            </w:r>
+            <w:proofErr w:type="spellStart"/>
+            <w:r>
+              <w:t>National_Football_League</w:t>
+            </w:r>
+            <w:proofErr w:type="spellEnd"/>
+            <w:r>
+              <w:t>, found through hyperlinks. Both approaches included the draft article containing the required names, and all four modes passed.</w:t>
+            </w:r>
+          </w:p>
+          <w:p>
+            <w:r>
+              <w:t>This shows that graph retrieval changed the supporting context, but it did not improve answer accuracy because the baseline already had the necessary information.</w:t>
+            </w:r>
           </w:p>
         </w:tc>
       </w:tr>
@@ -2485,7 +2571,7 @@
                 <w:sz w:val="24"/>
                 <w:szCs w:val="24"/>
               </w:rPr>
-              <w:t>Example 3 (optional)</w:t>
+              <w:t>Example 2: Query, retrieved information, and result</w:t>
             </w:r>
           </w:p>
         </w:tc>
@@ -2507,263 +2593,47 @@
           <w:p>
             <w:pPr>
               <w:rPr>
-                <w:sz w:val="24"/>
-                <w:szCs w:val="24"/>
+                <w:lang w:eastAsia="en-US"/>
               </w:rPr>
             </w:pPr>
             <w:r>
-              <w:rPr>
-                <w:sz w:val="24"/>
-                <w:szCs w:val="24"/>
-              </w:rPr>
-              <w:t>Response:</w:t>
-            </w:r>
-          </w:p>
-          <w:p>
-            <w:pPr>
-              <w:spacing w:after="120"/>
-              <w:rPr>
-                <w:sz w:val="24"/>
-                <w:szCs w:val="24"/>
-              </w:rPr>
-            </w:pPr>
-          </w:p>
-          <w:p>
-            <w:pPr>
-              <w:spacing w:after="120"/>
-              <w:rPr>
-                <w:sz w:val="24"/>
-                <w:szCs w:val="24"/>
-              </w:rPr>
-            </w:pPr>
-          </w:p>
-          <w:p>
-            <w:pPr>
-              <w:spacing w:after="120"/>
-              <w:rPr>
-                <w:sz w:val="24"/>
-                <w:szCs w:val="24"/>
-              </w:rPr>
-            </w:pPr>
-          </w:p>
-        </w:tc>
-      </w:tr>
-    </w:tbl>
-    <w:p/>
-    <w:p>
-      <w:pPr>
-        <w:pStyle w:val="Heading1"/>
-      </w:pPr>
-      <w:r>
-        <w:t xml:space="preserve">Step </w:t>
-      </w:r>
-      <w:r>
-        <w:t xml:space="preserve">6. </w:t>
-      </w:r>
-      <w:r>
-        <w:t>Architectural Impact Analysis</w:t>
-      </w:r>
-    </w:p>
-    <w:p>
-      <w:pPr>
-        <w:pBdr>
-          <w:top w:val="nil"/>
-          <w:left w:val="nil"/>
-          <w:bottom w:val="nil"/>
-          <w:right w:val="nil"/>
-          <w:between w:val="nil"/>
-        </w:pBdr>
-        <w:rPr>
-          <w:rFonts w:eastAsia="Aptos"/>
-          <w:color w:val="000000"/>
-          <w:sz w:val="24"/>
-          <w:szCs w:val="24"/>
-        </w:rPr>
-      </w:pPr>
-      <w:r>
-        <w:rPr>
-          <w:rFonts w:eastAsia="Aptos"/>
-          <w:color w:val="000000"/>
-          <w:sz w:val="24"/>
-          <w:szCs w:val="24"/>
-        </w:rPr>
-        <w:t>Analyze the impact of the retrieval strategy.</w:t>
-      </w:r>
-    </w:p>
-    <w:p>
-      <w:pPr>
-        <w:pStyle w:val="ListParagraph"/>
-        <w:numPr>
-          <w:ilvl w:val="0"/>
-          <w:numId w:val="15"/>
-        </w:numPr>
-        <w:pBdr>
-          <w:top w:val="nil"/>
-          <w:left w:val="nil"/>
-          <w:bottom w:val="nil"/>
-          <w:right w:val="nil"/>
-          <w:between w:val="nil"/>
-        </w:pBdr>
-        <w:rPr>
-          <w:rFonts w:eastAsia="Aptos"/>
-          <w:color w:val="000000"/>
-          <w:sz w:val="24"/>
-          <w:szCs w:val="24"/>
-        </w:rPr>
-      </w:pPr>
-      <w:r>
-        <w:rPr>
-          <w:rFonts w:eastAsia="Aptos"/>
-          <w:color w:val="000000"/>
-          <w:sz w:val="24"/>
-          <w:szCs w:val="24"/>
-        </w:rPr>
-        <w:t>What improved?</w:t>
-      </w:r>
-    </w:p>
-    <w:p>
-      <w:pPr>
-        <w:pStyle w:val="ListParagraph"/>
-        <w:numPr>
-          <w:ilvl w:val="0"/>
-          <w:numId w:val="15"/>
-        </w:numPr>
-        <w:pBdr>
-          <w:top w:val="nil"/>
-          <w:left w:val="nil"/>
-          <w:bottom w:val="nil"/>
-          <w:right w:val="nil"/>
-          <w:between w:val="nil"/>
-        </w:pBdr>
-        <w:rPr>
-          <w:rFonts w:eastAsia="Aptos"/>
-          <w:color w:val="000000"/>
-          <w:sz w:val="24"/>
-          <w:szCs w:val="24"/>
-        </w:rPr>
-      </w:pPr>
-      <w:r>
-        <w:rPr>
-          <w:rFonts w:eastAsia="Aptos"/>
-          <w:color w:val="000000"/>
-          <w:sz w:val="24"/>
-          <w:szCs w:val="24"/>
-        </w:rPr>
-        <w:t>What remained challenging?</w:t>
-      </w:r>
-    </w:p>
-    <w:p>
-      <w:pPr>
-        <w:pStyle w:val="ListParagraph"/>
-        <w:numPr>
-          <w:ilvl w:val="0"/>
-          <w:numId w:val="15"/>
-        </w:numPr>
-        <w:pBdr>
-          <w:top w:val="nil"/>
-          <w:left w:val="nil"/>
-          <w:bottom w:val="nil"/>
-          <w:right w:val="nil"/>
-          <w:between w:val="nil"/>
-        </w:pBdr>
-        <w:rPr>
-          <w:rFonts w:eastAsia="Aptos"/>
-          <w:color w:val="000000"/>
-          <w:sz w:val="24"/>
-          <w:szCs w:val="24"/>
-        </w:rPr>
-      </w:pPr>
-      <w:r>
-        <w:rPr>
-          <w:rFonts w:eastAsia="Aptos"/>
-          <w:color w:val="000000"/>
-          <w:sz w:val="24"/>
-          <w:szCs w:val="24"/>
-        </w:rPr>
-        <w:t>Did the strategy address the original failure?</w:t>
-      </w:r>
-    </w:p>
-    <w:tbl>
-      <w:tblPr>
-        <w:tblW w:w="10080" w:type="dxa"/>
-        <w:jc w:val="center"/>
-        <w:tblLayout w:type="fixed"/>
-        <w:tblLook w:val="0400" w:firstRow="0" w:lastRow="0" w:firstColumn="0" w:lastColumn="0" w:noHBand="0" w:noVBand="1"/>
-      </w:tblPr>
-      <w:tblGrid>
-        <w:gridCol w:w="10080"/>
-      </w:tblGrid>
-      <w:tr>
-        <w:trPr>
-          <w:jc w:val="center"/>
-        </w:trPr>
-        <w:tc>
-          <w:tcPr>
-            <w:tcW w:w="10080" w:type="dxa"/>
-            <w:tcBorders>
-              <w:top w:val="single" w:sz="6" w:space="0" w:color="BFBFBF"/>
-              <w:left w:val="single" w:sz="6" w:space="0" w:color="BFBFBF"/>
-              <w:bottom w:val="single" w:sz="6" w:space="0" w:color="BFBFBF"/>
-              <w:right w:val="single" w:sz="6" w:space="0" w:color="BFBFBF"/>
-            </w:tcBorders>
-            <w:shd w:val="clear" w:color="auto" w:fill="F2F2F2"/>
-          </w:tcPr>
-          <w:p>
-            <w:pPr>
-              <w:rPr>
-                <w:sz w:val="24"/>
-                <w:szCs w:val="24"/>
-              </w:rPr>
-            </w:pPr>
-            <w:r>
-              <w:rPr>
-                <w:b/>
-                <w:bCs/>
-                <w:sz w:val="24"/>
-                <w:szCs w:val="24"/>
-              </w:rPr>
-              <w:t>Improvements observed</w:t>
-            </w:r>
-          </w:p>
-        </w:tc>
-      </w:tr>
-      <w:tr>
-        <w:trPr>
-          <w:jc w:val="center"/>
-        </w:trPr>
-        <w:tc>
-          <w:tcPr>
-            <w:tcW w:w="10080" w:type="dxa"/>
-            <w:tcBorders>
-              <w:top w:val="single" w:sz="6" w:space="0" w:color="BFBFBF"/>
-              <w:left w:val="single" w:sz="6" w:space="0" w:color="BFBFBF"/>
-              <w:bottom w:val="single" w:sz="6" w:space="0" w:color="BFBFBF"/>
-              <w:right w:val="single" w:sz="6" w:space="0" w:color="BFBFBF"/>
-            </w:tcBorders>
-          </w:tcPr>
-          <w:p>
-            <w:pPr>
-              <w:rPr>
-                <w:sz w:val="24"/>
-                <w:szCs w:val="24"/>
-              </w:rPr>
-            </w:pPr>
-            <w:r>
-              <w:rPr>
-                <w:sz w:val="24"/>
-                <w:szCs w:val="24"/>
-              </w:rPr>
-              <w:t>Response:</w:t>
-            </w:r>
-          </w:p>
-          <w:p>
-            <w:pPr>
-              <w:spacing w:after="120"/>
-              <w:rPr>
-                <w:sz w:val="24"/>
-                <w:szCs w:val="24"/>
-              </w:rPr>
-            </w:pPr>
+              <w:t xml:space="preserve">For “When did Cooter Davenport, die?”, the baseline and decomposition modes retrieved the Ben Jones article, The Dukes of Hazzard, and </w:t>
+            </w:r>
+            <w:proofErr w:type="spellStart"/>
+            <w:r>
+              <w:t>Davy_Crockett</w:t>
+            </w:r>
+            <w:proofErr w:type="spellEnd"/>
+            <w:r>
+              <w:t xml:space="preserve">. The graph modes replaced the third article with </w:t>
+            </w:r>
+            <w:proofErr w:type="spellStart"/>
+            <w:proofErr w:type="gramStart"/>
+            <w:r>
+              <w:t>Nashville,_</w:t>
+            </w:r>
+            <w:proofErr w:type="gramEnd"/>
+            <w:r>
+              <w:t>Tennessee</w:t>
+            </w:r>
+            <w:proofErr w:type="spellEnd"/>
+            <w:r>
+              <w:t>.</w:t>
+            </w:r>
+          </w:p>
+          <w:p>
+            <w:r>
+              <w:t xml:space="preserve">Baseline and graph answers passed. The decomposition answer included the expected date but was marked fail, which appears inconsistent with the grading notes. The </w:t>
+            </w:r>
+            <w:r>
+              <w:lastRenderedPageBreak/>
+              <w:t>combined answer explained that Cooter was fictional and did not provide the actor’s death date, so it failed the rubric.</w:t>
+            </w:r>
+          </w:p>
+          <w:p>
+            <w:r>
+              <w:t>This example exposed an evaluation problem: the question names a character, while the rubric expects information about the actor. All modes retrieved the actor’s article, so the failures cannot be attributed simply to missing evidence.</w:t>
+            </w:r>
           </w:p>
         </w:tc>
       </w:tr>
@@ -2808,7 +2678,7 @@
                 <w:sz w:val="24"/>
                 <w:szCs w:val="24"/>
               </w:rPr>
-              <w:t>Remaining limitations or challenges</w:t>
+              <w:t>Example 3 (optional)</w:t>
             </w:r>
           </w:p>
         </w:tc>
@@ -2830,37 +2700,167 @@
           <w:p>
             <w:pPr>
               <w:rPr>
-                <w:sz w:val="24"/>
-                <w:szCs w:val="24"/>
+                <w:lang w:eastAsia="en-US"/>
               </w:rPr>
             </w:pPr>
             <w:r>
-              <w:rPr>
-                <w:sz w:val="24"/>
-                <w:szCs w:val="24"/>
-              </w:rPr>
-              <w:t>Response:</w:t>
-            </w:r>
-          </w:p>
-          <w:p>
-            <w:pPr>
-              <w:spacing w:after="120"/>
-              <w:rPr>
-                <w:sz w:val="24"/>
-                <w:szCs w:val="24"/>
-              </w:rPr>
-            </w:pPr>
+              <w:t xml:space="preserve">For “When and for how much did the Brady Bunch house sell?”, every mode retrieved </w:t>
+            </w:r>
+            <w:proofErr w:type="spellStart"/>
+            <w:proofErr w:type="gramStart"/>
+            <w:r>
+              <w:t>The</w:t>
+            </w:r>
+            <w:proofErr w:type="gramEnd"/>
+            <w:r>
+              <w:t>_Brady_Bunch</w:t>
+            </w:r>
+            <w:proofErr w:type="spellEnd"/>
+            <w:r>
+              <w:t xml:space="preserve"> and answered September 11, 2023, and $3.2 million, matching the indexed source. All four answers passed.</w:t>
+            </w:r>
+          </w:p>
+          <w:p>
+            <w:r>
+              <w:t>The extra documents varied, but the answer-bearing article remained the same. This suggests that decomposition and graph traversal added no clear benefit for this question, since one article already contained both required facts.</w:t>
+            </w:r>
           </w:p>
         </w:tc>
       </w:tr>
     </w:tbl>
+    <w:p/>
     <w:p>
       <w:pPr>
-        <w:rPr>
-          <w:sz w:val="24"/>
-          <w:szCs w:val="24"/>
-        </w:rPr>
-      </w:pPr>
+        <w:pStyle w:val="Heading1"/>
+      </w:pPr>
+      <w:r>
+        <w:t xml:space="preserve">Step </w:t>
+      </w:r>
+      <w:r>
+        <w:t xml:space="preserve">6. </w:t>
+      </w:r>
+      <w:r>
+        <w:t>Architectural Impact Analysis</w:t>
+      </w:r>
+    </w:p>
+    <w:p>
+      <w:pPr>
+        <w:pBdr>
+          <w:top w:val="nil"/>
+          <w:left w:val="nil"/>
+          <w:bottom w:val="nil"/>
+          <w:right w:val="nil"/>
+          <w:between w:val="nil"/>
+        </w:pBdr>
+        <w:rPr>
+          <w:rFonts w:eastAsia="Aptos"/>
+          <w:color w:val="000000"/>
+          <w:sz w:val="24"/>
+          <w:szCs w:val="24"/>
+        </w:rPr>
+      </w:pPr>
+      <w:r>
+        <w:rPr>
+          <w:rFonts w:eastAsia="Aptos"/>
+          <w:color w:val="000000"/>
+          <w:sz w:val="24"/>
+          <w:szCs w:val="24"/>
+        </w:rPr>
+        <w:t>Analyze the impact of the retrieval strategy.</w:t>
+      </w:r>
+    </w:p>
+    <w:p>
+      <w:pPr>
+        <w:pStyle w:val="ListParagraph"/>
+        <w:numPr>
+          <w:ilvl w:val="0"/>
+          <w:numId w:val="15"/>
+        </w:numPr>
+        <w:pBdr>
+          <w:top w:val="nil"/>
+          <w:left w:val="nil"/>
+          <w:bottom w:val="nil"/>
+          <w:right w:val="nil"/>
+          <w:between w:val="nil"/>
+        </w:pBdr>
+        <w:rPr>
+          <w:rFonts w:eastAsia="Aptos"/>
+          <w:color w:val="000000"/>
+          <w:sz w:val="24"/>
+          <w:szCs w:val="24"/>
+        </w:rPr>
+      </w:pPr>
+      <w:r>
+        <w:rPr>
+          <w:rFonts w:eastAsia="Aptos"/>
+          <w:color w:val="000000"/>
+          <w:sz w:val="24"/>
+          <w:szCs w:val="24"/>
+        </w:rPr>
+        <w:t>What improved?</w:t>
+      </w:r>
+    </w:p>
+    <w:p>
+      <w:pPr>
+        <w:pStyle w:val="ListParagraph"/>
+        <w:numPr>
+          <w:ilvl w:val="0"/>
+          <w:numId w:val="15"/>
+        </w:numPr>
+        <w:pBdr>
+          <w:top w:val="nil"/>
+          <w:left w:val="nil"/>
+          <w:bottom w:val="nil"/>
+          <w:right w:val="nil"/>
+          <w:between w:val="nil"/>
+        </w:pBdr>
+        <w:rPr>
+          <w:rFonts w:eastAsia="Aptos"/>
+          <w:color w:val="000000"/>
+          <w:sz w:val="24"/>
+          <w:szCs w:val="24"/>
+        </w:rPr>
+      </w:pPr>
+      <w:r>
+        <w:rPr>
+          <w:rFonts w:eastAsia="Aptos"/>
+          <w:color w:val="000000"/>
+          <w:sz w:val="24"/>
+          <w:szCs w:val="24"/>
+        </w:rPr>
+        <w:t>What remained challenging?</w:t>
+      </w:r>
+    </w:p>
+    <w:p>
+      <w:pPr>
+        <w:pStyle w:val="ListParagraph"/>
+        <w:numPr>
+          <w:ilvl w:val="0"/>
+          <w:numId w:val="15"/>
+        </w:numPr>
+        <w:pBdr>
+          <w:top w:val="nil"/>
+          <w:left w:val="nil"/>
+          <w:bottom w:val="nil"/>
+          <w:right w:val="nil"/>
+          <w:between w:val="nil"/>
+        </w:pBdr>
+        <w:rPr>
+          <w:rFonts w:eastAsia="Aptos"/>
+          <w:color w:val="000000"/>
+          <w:sz w:val="24"/>
+          <w:szCs w:val="24"/>
+        </w:rPr>
+      </w:pPr>
+      <w:r>
+        <w:rPr>
+          <w:rFonts w:eastAsia="Aptos"/>
+          <w:color w:val="000000"/>
+          <w:sz w:val="24"/>
+          <w:szCs w:val="24"/>
+        </w:rPr>
+        <w:t>Did the strategy address the original failure?</w:t>
+      </w:r>
     </w:p>
     <w:tbl>
       <w:tblPr>
@@ -2901,7 +2901,7 @@
                 <w:sz w:val="24"/>
                 <w:szCs w:val="24"/>
               </w:rPr>
-              <w:t>Did the strategy address the original failure?</w:t>
+              <w:t>Improvements observed</w:t>
             </w:r>
           </w:p>
         </w:tc>
@@ -2923,120 +2923,111 @@
           <w:p>
             <w:pPr>
               <w:rPr>
-                <w:sz w:val="24"/>
-                <w:szCs w:val="24"/>
+                <w:lang w:eastAsia="en-US"/>
               </w:rPr>
             </w:pPr>
             <w:r>
-              <w:rPr>
-                <w:sz w:val="24"/>
-                <w:szCs w:val="24"/>
-              </w:rPr>
-              <w:t>Response:</w:t>
-            </w:r>
-          </w:p>
-          <w:p>
-            <w:pPr>
-              <w:spacing w:after="120"/>
-              <w:rPr>
-                <w:sz w:val="24"/>
-                <w:szCs w:val="24"/>
-              </w:rPr>
-            </w:pPr>
+              <w:t>The updated system can follow connections between articles and show how it found additional context. For the NFL draft question, graph retrieval replaced a 2021 NBA draft article with the more closely related National Football League article. The source labels also made the results easier to inspect.</w:t>
+            </w:r>
+          </w:p>
+          <w:p>
+            <w:r>
+              <w:t>These changes did not improve the recorded answer pass rate. Graph retrieval matched the baseline at 3/3, while decomposition and combined retrieval recorded 2/3.</w:t>
+            </w:r>
           </w:p>
         </w:tc>
       </w:tr>
     </w:tbl>
     <w:p/>
-    <w:p/>
+    <w:tbl>
+      <w:tblPr>
+        <w:tblW w:w="10080" w:type="dxa"/>
+        <w:jc w:val="center"/>
+        <w:tblLayout w:type="fixed"/>
+        <w:tblLook w:val="0400" w:firstRow="0" w:lastRow="0" w:firstColumn="0" w:lastColumn="0" w:noHBand="0" w:noVBand="1"/>
+      </w:tblPr>
+      <w:tblGrid>
+        <w:gridCol w:w="10080"/>
+      </w:tblGrid>
+      <w:tr>
+        <w:trPr>
+          <w:jc w:val="center"/>
+        </w:trPr>
+        <w:tc>
+          <w:tcPr>
+            <w:tcW w:w="10080" w:type="dxa"/>
+            <w:tcBorders>
+              <w:top w:val="single" w:sz="6" w:space="0" w:color="BFBFBF"/>
+              <w:left w:val="single" w:sz="6" w:space="0" w:color="BFBFBF"/>
+              <w:bottom w:val="single" w:sz="6" w:space="0" w:color="BFBFBF"/>
+              <w:right w:val="single" w:sz="6" w:space="0" w:color="BFBFBF"/>
+            </w:tcBorders>
+            <w:shd w:val="clear" w:color="auto" w:fill="F2F2F2"/>
+          </w:tcPr>
+          <w:p>
+            <w:pPr>
+              <w:rPr>
+                <w:sz w:val="24"/>
+                <w:szCs w:val="24"/>
+              </w:rPr>
+            </w:pPr>
+            <w:r>
+              <w:rPr>
+                <w:b/>
+                <w:bCs/>
+                <w:sz w:val="24"/>
+                <w:szCs w:val="24"/>
+              </w:rPr>
+              <w:t>Remaining limitations or challenges</w:t>
+            </w:r>
+          </w:p>
+        </w:tc>
+      </w:tr>
+      <w:tr>
+        <w:trPr>
+          <w:jc w:val="center"/>
+        </w:trPr>
+        <w:tc>
+          <w:tcPr>
+            <w:tcW w:w="10080" w:type="dxa"/>
+            <w:tcBorders>
+              <w:top w:val="single" w:sz="6" w:space="0" w:color="BFBFBF"/>
+              <w:left w:val="single" w:sz="6" w:space="0" w:color="BFBFBF"/>
+              <w:bottom w:val="single" w:sz="6" w:space="0" w:color="BFBFBF"/>
+              <w:right w:val="single" w:sz="6" w:space="0" w:color="BFBFBF"/>
+            </w:tcBorders>
+          </w:tcPr>
+          <w:p>
+            <w:pPr>
+              <w:rPr>
+                <w:lang w:eastAsia="en-US"/>
+              </w:rPr>
+            </w:pPr>
+            <w:r>
+              <w:t>Related articles are not always useful. For example, graph retrieval added a Nashville article to the Cooter Davenport results without providing needed evidence. Decomposition also sometimes returned the same unnecessary articles as the baseline.</w:t>
+            </w:r>
+          </w:p>
+          <w:p>
+            <w:pPr>
+              <w:rPr>
+                <w:sz w:val="24"/>
+                <w:szCs w:val="24"/>
+              </w:rPr>
+            </w:pPr>
+            <w:r>
+              <w:t>Evaluation remained a challenge. The Cooter question confused a fictional character with the actor, and the judge rejected one answer that included the expected date. The small three-question test set also limits how broadly I can interpret the results. Decomposition requires additional model and search calls, but I have not measured the cost or latency difference.</w:t>
+            </w:r>
+          </w:p>
+        </w:tc>
+      </w:tr>
+    </w:tbl>
     <w:p>
       <w:pPr>
-        <w:pStyle w:val="Heading1"/>
-      </w:pPr>
-      <w:r>
-        <w:lastRenderedPageBreak/>
-        <w:t xml:space="preserve">Step </w:t>
-      </w:r>
-      <w:r>
-        <w:t>7. Reflection and Next Steps</w:t>
-      </w:r>
-    </w:p>
-    <w:p>
-      <w:pPr>
-        <w:rPr>
-          <w:sz w:val="24"/>
-          <w:szCs w:val="24"/>
-        </w:rPr>
-      </w:pPr>
-      <w:r>
-        <w:rPr>
-          <w:sz w:val="24"/>
-          <w:szCs w:val="24"/>
-        </w:rPr>
-        <w:t>Reflect on the effectiveness of the architectural redesign.</w:t>
-      </w:r>
-    </w:p>
-    <w:p>
-      <w:pPr>
-        <w:pStyle w:val="ListParagraph"/>
-        <w:numPr>
-          <w:ilvl w:val="0"/>
-          <w:numId w:val="16"/>
-        </w:numPr>
-        <w:rPr>
-          <w:sz w:val="24"/>
-          <w:szCs w:val="24"/>
-        </w:rPr>
-      </w:pPr>
-      <w:r>
-        <w:rPr>
-          <w:sz w:val="24"/>
-          <w:szCs w:val="24"/>
-        </w:rPr>
-        <w:t>What did you learn from implementing this strategy?</w:t>
-      </w:r>
-    </w:p>
-    <w:p>
-      <w:pPr>
-        <w:pStyle w:val="ListParagraph"/>
-        <w:numPr>
-          <w:ilvl w:val="0"/>
-          <w:numId w:val="16"/>
-        </w:numPr>
-        <w:rPr>
-          <w:sz w:val="24"/>
-          <w:szCs w:val="24"/>
-        </w:rPr>
-      </w:pPr>
-      <w:r>
-        <w:rPr>
-          <w:sz w:val="24"/>
-          <w:szCs w:val="24"/>
-        </w:rPr>
-        <w:t>What would you improve next?</w:t>
-      </w:r>
-    </w:p>
-    <w:p>
-      <w:pPr>
-        <w:pStyle w:val="ListParagraph"/>
-        <w:numPr>
-          <w:ilvl w:val="0"/>
-          <w:numId w:val="16"/>
-        </w:numPr>
-        <w:rPr>
-          <w:rFonts w:eastAsia="Aptos"/>
-          <w:color w:val="000000"/>
-          <w:sz w:val="24"/>
-          <w:szCs w:val="24"/>
-        </w:rPr>
-      </w:pPr>
-      <w:r>
-        <w:rPr>
-          <w:sz w:val="24"/>
-          <w:szCs w:val="24"/>
-        </w:rPr>
-        <w:t>Are there additional retrieval failures that still need to be addressed?</w:t>
-      </w:r>
+        <w:rPr>
+          <w:sz w:val="24"/>
+          <w:szCs w:val="24"/>
+        </w:rPr>
+      </w:pPr>
     </w:p>
     <w:tbl>
       <w:tblPr>
@@ -3077,7 +3068,7 @@
                 <w:sz w:val="24"/>
                 <w:szCs w:val="24"/>
               </w:rPr>
-              <w:t>Reflection on the architectural redesign</w:t>
+              <w:t>Did the strategy address the original failure?</w:t>
             </w:r>
           </w:p>
         </w:tc>
@@ -3099,50 +3090,102 @@
           <w:p>
             <w:pPr>
               <w:rPr>
+                <w:lang w:eastAsia="en-US"/>
+              </w:rPr>
+            </w:pPr>
+            <w:r>
+              <w:t>Only partially. The strategy changed how supporting articles were selected and sometimes produced more closely related context, but it did not consistently remove unnecessary information.</w:t>
+            </w:r>
+          </w:p>
+          <w:p>
+            <w:pPr>
+              <w:rPr>
                 <w:sz w:val="24"/>
                 <w:szCs w:val="24"/>
               </w:rPr>
             </w:pPr>
             <w:r>
-              <w:rPr>
-                <w:sz w:val="24"/>
-                <w:szCs w:val="24"/>
-              </w:rPr>
-              <w:t>Response:</w:t>
-            </w:r>
-          </w:p>
-          <w:p>
-            <w:pPr>
-              <w:spacing w:after="120"/>
-              <w:rPr>
-                <w:sz w:val="24"/>
-                <w:szCs w:val="24"/>
-              </w:rPr>
-            </w:pPr>
-          </w:p>
-          <w:p>
-            <w:pPr>
-              <w:spacing w:after="120"/>
-              <w:rPr>
-                <w:sz w:val="24"/>
-                <w:szCs w:val="24"/>
-              </w:rPr>
-            </w:pPr>
-          </w:p>
-          <w:p>
-            <w:pPr>
-              <w:spacing w:after="120"/>
-              <w:rPr>
-                <w:sz w:val="24"/>
-                <w:szCs w:val="24"/>
-              </w:rPr>
-            </w:pPr>
+              <w:t>The original limitation was weak relevance filtering, and following links or splitting questions does not automatically solve that problem. My next step would be to improve how the system selects extra context and allow it to return fewer documents when additional articles do not help.</w:t>
+            </w:r>
           </w:p>
         </w:tc>
       </w:tr>
     </w:tbl>
+    <w:p/>
+    <w:p/>
     <w:p>
       <w:pPr>
+        <w:pStyle w:val="Heading1"/>
+      </w:pPr>
+      <w:r>
+        <w:t xml:space="preserve">Step </w:t>
+      </w:r>
+      <w:r>
+        <w:t>7. Reflection and Next Steps</w:t>
+      </w:r>
+    </w:p>
+    <w:p>
+      <w:pPr>
+        <w:rPr>
+          <w:sz w:val="24"/>
+          <w:szCs w:val="24"/>
+        </w:rPr>
+      </w:pPr>
+      <w:r>
+        <w:rPr>
+          <w:sz w:val="24"/>
+          <w:szCs w:val="24"/>
+        </w:rPr>
+        <w:t>Reflect on the effectiveness of the architectural redesign.</w:t>
+      </w:r>
+    </w:p>
+    <w:p>
+      <w:pPr>
+        <w:pStyle w:val="ListParagraph"/>
+        <w:numPr>
+          <w:ilvl w:val="0"/>
+          <w:numId w:val="16"/>
+        </w:numPr>
+        <w:rPr>
+          <w:sz w:val="24"/>
+          <w:szCs w:val="24"/>
+        </w:rPr>
+      </w:pPr>
+      <w:r>
+        <w:rPr>
+          <w:sz w:val="24"/>
+          <w:szCs w:val="24"/>
+        </w:rPr>
+        <w:t>What did you learn from implementing this strategy?</w:t>
+      </w:r>
+    </w:p>
+    <w:p>
+      <w:pPr>
+        <w:pStyle w:val="ListParagraph"/>
+        <w:numPr>
+          <w:ilvl w:val="0"/>
+          <w:numId w:val="16"/>
+        </w:numPr>
+        <w:rPr>
+          <w:sz w:val="24"/>
+          <w:szCs w:val="24"/>
+        </w:rPr>
+      </w:pPr>
+      <w:r>
+        <w:rPr>
+          <w:sz w:val="24"/>
+          <w:szCs w:val="24"/>
+        </w:rPr>
+        <w:t>What would you improve next?</w:t>
+      </w:r>
+    </w:p>
+    <w:p>
+      <w:pPr>
+        <w:pStyle w:val="ListParagraph"/>
+        <w:numPr>
+          <w:ilvl w:val="0"/>
+          <w:numId w:val="16"/>
+        </w:numPr>
         <w:rPr>
           <w:rFonts w:eastAsia="Aptos"/>
           <w:color w:val="000000"/>
@@ -3150,6 +3193,13 @@
           <w:szCs w:val="24"/>
         </w:rPr>
       </w:pPr>
+      <w:r>
+        <w:rPr>
+          <w:sz w:val="24"/>
+          <w:szCs w:val="24"/>
+        </w:rPr>
+        <w:t>Are there additional retrieval failures that still need to be addressed?</w:t>
+      </w:r>
     </w:p>
     <w:tbl>
       <w:tblPr>
@@ -3190,7 +3240,8 @@
                 <w:sz w:val="24"/>
                 <w:szCs w:val="24"/>
               </w:rPr>
-              <w:t>Specific improvements or next steps</w:t>
+              <w:lastRenderedPageBreak/>
+              <w:t>Reflection on the architectural redesign</w:t>
             </w:r>
           </w:p>
         </w:tc>
@@ -3212,44 +3263,117 @@
           <w:p>
             <w:pPr>
               <w:rPr>
+                <w:lang w:eastAsia="en-US"/>
+              </w:rPr>
+            </w:pPr>
+            <w:r>
+              <w:t>I expected decomposition and graph retrieval to improve the answers, but the results showed that adding more steps does not always help. The baseline already found the right article for each question. The harder problem was keeping unnecessary articles out of the results.</w:t>
+            </w:r>
+          </w:p>
+          <w:p>
+            <w:r>
+              <w:t>Building these features helped me understand what happens between asking a question and generating an answer. I could see the smaller searches and which article links the system followed. I also learned to look beyond the pass/fail scores. The Cooter question was ambiguous, and one answer received a failing grade even though it included the expected date.</w:t>
+            </w:r>
+          </w:p>
+        </w:tc>
+      </w:tr>
+    </w:tbl>
+    <w:p>
+      <w:pPr>
+        <w:rPr>
+          <w:rFonts w:eastAsia="Aptos"/>
+          <w:color w:val="000000"/>
+          <w:sz w:val="24"/>
+          <w:szCs w:val="24"/>
+        </w:rPr>
+      </w:pPr>
+    </w:p>
+    <w:tbl>
+      <w:tblPr>
+        <w:tblW w:w="10080" w:type="dxa"/>
+        <w:jc w:val="center"/>
+        <w:tblLayout w:type="fixed"/>
+        <w:tblLook w:val="0400" w:firstRow="0" w:lastRow="0" w:firstColumn="0" w:lastColumn="0" w:noHBand="0" w:noVBand="1"/>
+      </w:tblPr>
+      <w:tblGrid>
+        <w:gridCol w:w="10080"/>
+      </w:tblGrid>
+      <w:tr>
+        <w:trPr>
+          <w:jc w:val="center"/>
+        </w:trPr>
+        <w:tc>
+          <w:tcPr>
+            <w:tcW w:w="10080" w:type="dxa"/>
+            <w:tcBorders>
+              <w:top w:val="single" w:sz="6" w:space="0" w:color="BFBFBF"/>
+              <w:left w:val="single" w:sz="6" w:space="0" w:color="BFBFBF"/>
+              <w:bottom w:val="single" w:sz="6" w:space="0" w:color="BFBFBF"/>
+              <w:right w:val="single" w:sz="6" w:space="0" w:color="BFBFBF"/>
+            </w:tcBorders>
+            <w:shd w:val="clear" w:color="auto" w:fill="F2F2F2"/>
+          </w:tcPr>
+          <w:p>
+            <w:pPr>
+              <w:rPr>
                 <w:sz w:val="24"/>
                 <w:szCs w:val="24"/>
               </w:rPr>
             </w:pPr>
             <w:r>
               <w:rPr>
+                <w:b/>
+                <w:bCs/>
                 <w:sz w:val="24"/>
                 <w:szCs w:val="24"/>
               </w:rPr>
-              <w:t>Response:</w:t>
-            </w:r>
-          </w:p>
+              <w:t>Specific improvements or next steps</w:t>
+            </w:r>
+          </w:p>
+        </w:tc>
+      </w:tr>
+      <w:tr>
+        <w:trPr>
+          <w:jc w:val="center"/>
+        </w:trPr>
+        <w:tc>
+          <w:tcPr>
+            <w:tcW w:w="10080" w:type="dxa"/>
+            <w:tcBorders>
+              <w:top w:val="single" w:sz="6" w:space="0" w:color="BFBFBF"/>
+              <w:left w:val="single" w:sz="6" w:space="0" w:color="BFBFBF"/>
+              <w:bottom w:val="single" w:sz="6" w:space="0" w:color="BFBFBF"/>
+              <w:right w:val="single" w:sz="6" w:space="0" w:color="BFBFBF"/>
+            </w:tcBorders>
+          </w:tcPr>
           <w:p>
             <w:pPr>
-              <w:spacing w:after="120"/>
+              <w:rPr>
+                <w:lang w:eastAsia="en-US"/>
+              </w:rPr>
+            </w:pPr>
+            <w:r>
+              <w:t>I would start by making the test questions and grading notes clearer. Then I would work on filtering out weak results instead of always sending three articles to the model.</w:t>
+            </w:r>
+          </w:p>
+          <w:p>
+            <w:pPr>
               <w:rPr>
                 <w:sz w:val="24"/>
                 <w:szCs w:val="24"/>
               </w:rPr>
             </w:pPr>
-          </w:p>
-          <w:p>
-            <w:pPr>
-              <w:spacing w:after="120"/>
-              <w:rPr>
-                <w:sz w:val="24"/>
-                <w:szCs w:val="24"/>
-              </w:rPr>
-            </w:pPr>
-          </w:p>
-          <w:p>
-            <w:pPr>
-              <w:spacing w:after="120"/>
-              <w:rPr>
-                <w:sz w:val="24"/>
-                <w:szCs w:val="24"/>
-              </w:rPr>
-            </w:pPr>
+            <w:r>
+              <w:t xml:space="preserve">I would also add questions that need information from more than one article. That would give decomposition and graph retrieval a better test of where they might help. Finally, I would measure how much extra time and API usage they require and save the </w:t>
+            </w:r>
+            <w:proofErr w:type="gramStart"/>
+            <w:r>
+              <w:t>graph</w:t>
+            </w:r>
+            <w:proofErr w:type="gramEnd"/>
+            <w:r>
+              <w:t xml:space="preserve"> so it does not need to be rebuilt every run.</w:t>
+            </w:r>
           </w:p>
         </w:tc>
       </w:tr>
@@ -6547,6 +6671,91 @@
       </w:tblBorders>
     </w:tblPr>
   </w:style>
+  <w:style w:type="character" w:styleId="HTMLCode">
+    <w:name w:val="HTML Code"/>
+    <w:basedOn w:val="DefaultParagraphFont"/>
+    <w:uiPriority w:val="99"/>
+    <w:semiHidden/>
+    <w:unhideWhenUsed/>
+    <w:rsid w:val="001264FA"/>
+    <w:rPr>
+      <w:rFonts w:ascii="Courier New" w:eastAsia="Times New Roman" w:hAnsi="Courier New" w:cs="Courier New"/>
+      <w:sz w:val="20"/>
+      <w:szCs w:val="20"/>
+    </w:rPr>
+  </w:style>
+  <w:style w:type="character" w:styleId="Strong">
+    <w:name w:val="Strong"/>
+    <w:basedOn w:val="DefaultParagraphFont"/>
+    <w:uiPriority w:val="22"/>
+    <w:qFormat/>
+    <w:rsid w:val="00BC2CA5"/>
+    <w:rPr>
+      <w:b/>
+      <w:bCs/>
+    </w:rPr>
+  </w:style>
+  <w:style w:type="paragraph" w:styleId="HTMLPreformatted">
+    <w:name w:val="HTML Preformatted"/>
+    <w:basedOn w:val="Normal"/>
+    <w:link w:val="HTMLPreformattedChar"/>
+    <w:uiPriority w:val="99"/>
+    <w:semiHidden/>
+    <w:unhideWhenUsed/>
+    <w:rsid w:val="00BC2CA5"/>
+    <w:pPr>
+      <w:tabs>
+        <w:tab w:val="left" w:pos="916"/>
+        <w:tab w:val="left" w:pos="1832"/>
+        <w:tab w:val="left" w:pos="2748"/>
+        <w:tab w:val="left" w:pos="3664"/>
+        <w:tab w:val="left" w:pos="4580"/>
+        <w:tab w:val="left" w:pos="5496"/>
+        <w:tab w:val="left" w:pos="6412"/>
+        <w:tab w:val="left" w:pos="7328"/>
+        <w:tab w:val="left" w:pos="8244"/>
+        <w:tab w:val="left" w:pos="9160"/>
+        <w:tab w:val="left" w:pos="10076"/>
+        <w:tab w:val="left" w:pos="10992"/>
+        <w:tab w:val="left" w:pos="11908"/>
+        <w:tab w:val="left" w:pos="12824"/>
+        <w:tab w:val="left" w:pos="13740"/>
+        <w:tab w:val="left" w:pos="14656"/>
+      </w:tabs>
+      <w:spacing w:after="0" w:line="240" w:lineRule="auto"/>
+    </w:pPr>
+    <w:rPr>
+      <w:rFonts w:ascii="Courier New" w:hAnsi="Courier New" w:cs="Courier New"/>
+      <w:sz w:val="20"/>
+      <w:szCs w:val="20"/>
+      <w:lang w:eastAsia="en-US"/>
+    </w:rPr>
+  </w:style>
+  <w:style w:type="character" w:customStyle="1" w:styleId="HTMLPreformattedChar">
+    <w:name w:val="HTML Preformatted Char"/>
+    <w:basedOn w:val="DefaultParagraphFont"/>
+    <w:link w:val="HTMLPreformatted"/>
+    <w:uiPriority w:val="99"/>
+    <w:semiHidden/>
+    <w:rsid w:val="00BC2CA5"/>
+    <w:rPr>
+      <w:rFonts w:ascii="Courier New" w:hAnsi="Courier New" w:cs="Courier New"/>
+      <w:sz w:val="20"/>
+      <w:szCs w:val="20"/>
+      <w:lang w:val="en-US" w:eastAsia="en-US"/>
+    </w:rPr>
+  </w:style>
+  <w:style w:type="character" w:styleId="Emphasis">
+    <w:name w:val="Emphasis"/>
+    <w:basedOn w:val="DefaultParagraphFont"/>
+    <w:uiPriority w:val="20"/>
+    <w:qFormat/>
+    <w:rsid w:val="005835F8"/>
+    <w:rPr>
+      <w:i/>
+      <w:iCs/>
+    </w:rPr>
+  </w:style>
 </w:styles>
 </file>
 

</xml_diff>